<commit_message>
docs(rapport): section 5.4 du module 4, captures des écrans et entrée P-M4-002
- section 5.4 rédigée sur le modèle de la 5.1 (tableaux 15 à 18, figures 32 à 38) ;
- 4 captures des écrans réels du module 4, annexe B complétée (tableau 19) ;
- 3 cadres « Capture à insérer » pour le prompt, le plan et le résumé.

Co-Authored-By: Claude Opus 5.5 <noreply@anthropic.com>
</commit_message>
<xml_diff>
--- a/docs/rapport/Rapport_Client_Infernal.docx
+++ b/docs/rapport/Rapport_Client_Infernal.docx
@@ -13464,6 +13464,3061 @@
     </w:p>
     <w:p>
       <w:pPr>
+        <w:spacing w:after="120" w:line="300"/>
+        <w:jc w:val="both"/>
+      </w:pPr>
+      <w:r>
+        <w:t xml:space="preserve">Le module 4 permet à l'étudiant de traduire ce qu'il a appris pendant l'entretien en un cahier des charges structuré, puis de le faire évaluer par le LLM. Le LLM compare le document au </w:t>
+      </w:r>
+      <w:r>
+        <w:rPr>
+          <w:b/>
+          <w:bCs/>
+        </w:rPr>
+        <w:t xml:space="preserve">véritable besoin du client</w:t>
+      </w:r>
+      <w:r>
+        <w:t xml:space="preserve"> (le besoin caché) et aux contraintes implicites, sans jamais les révéler : il note le travail selon une grille et propose des pistes. Le module conserve aussi les </w:t>
+      </w:r>
+      <w:r>
+        <w:rPr>
+          <w:b/>
+          <w:bCs/>
+        </w:rPr>
+        <w:t xml:space="preserve">versions successives</w:t>
+      </w:r>
+      <w:r>
+        <w:t xml:space="preserve"> du cahier des charges lorsque le client formule une demande de changement (module 3).</w:t>
+      </w:r>
+    </w:p>
+    <w:tbl>
+      <w:tblPr>
+        <w:tblW w:type="dxa" w:w="9638"/>
+        <w:tblBorders>
+          <w:top w:val="single" w:color="auto" w:sz="4"/>
+          <w:left w:val="single" w:color="auto" w:sz="4"/>
+          <w:bottom w:val="single" w:color="auto" w:sz="4"/>
+          <w:right w:val="single" w:color="auto" w:sz="4"/>
+          <w:insideH w:val="single" w:color="auto" w:sz="4"/>
+          <w:insideV w:val="single" w:color="auto" w:sz="4"/>
+        </w:tblBorders>
+      </w:tblPr>
+      <w:tblGrid>
+        <w:gridCol w:w="2505"/>
+        <w:gridCol w:w="7133"/>
+      </w:tblGrid>
+      <w:tr>
+        <w:trPr>
+          <w:tblHeader/>
+        </w:trPr>
+        <w:tc>
+          <w:tcPr>
+            <w:tcW w:type="dxa" w:w="2505"/>
+            <w:shd w:fill="B3261E" w:color="auto" w:val="clear"/>
+            <w:tcMar>
+              <w:top w:type="dxa" w:w="60"/>
+              <w:left w:type="dxa" w:w="100"/>
+              <w:bottom w:type="dxa" w:w="60"/>
+              <w:right w:type="dxa" w:w="100"/>
+            </w:tcMar>
+            <w:vAlign w:val="center"/>
+          </w:tcPr>
+          <w:p>
+            <w:pPr>
+              <w:spacing w:after="0"/>
+            </w:pPr>
+            <w:r>
+              <w:rPr>
+                <w:b/>
+                <w:bCs/>
+                <w:color w:val="FFFFFF"/>
+                <w:sz w:val="19"/>
+                <w:szCs w:val="19"/>
+              </w:rPr>
+              <w:t xml:space="preserve">Fonctionnalité</w:t>
+            </w:r>
+          </w:p>
+        </w:tc>
+        <w:tc>
+          <w:tcPr>
+            <w:tcW w:type="dxa" w:w="7133"/>
+            <w:shd w:fill="B3261E" w:color="auto" w:val="clear"/>
+            <w:tcMar>
+              <w:top w:type="dxa" w:w="60"/>
+              <w:left w:type="dxa" w:w="100"/>
+              <w:bottom w:type="dxa" w:w="60"/>
+              <w:right w:type="dxa" w:w="100"/>
+            </w:tcMar>
+            <w:vAlign w:val="center"/>
+          </w:tcPr>
+          <w:p>
+            <w:pPr>
+              <w:spacing w:after="0"/>
+            </w:pPr>
+            <w:r>
+              <w:rPr>
+                <w:b/>
+                <w:bCs/>
+                <w:color w:val="FFFFFF"/>
+                <w:sz w:val="19"/>
+                <w:szCs w:val="19"/>
+              </w:rPr>
+              <w:t xml:space="preserve">Réalisation</w:t>
+            </w:r>
+          </w:p>
+        </w:tc>
+      </w:tr>
+      <w:tr>
+        <w:tc>
+          <w:tcPr>
+            <w:tcW w:type="dxa" w:w="2505"/>
+            <w:tcMar>
+              <w:top w:type="dxa" w:w="60"/>
+              <w:left w:type="dxa" w:w="100"/>
+              <w:bottom w:type="dxa" w:w="60"/>
+              <w:right w:type="dxa" w:w="100"/>
+            </w:tcMar>
+            <w:vAlign w:val="center"/>
+          </w:tcPr>
+          <w:p>
+            <w:pPr>
+              <w:spacing w:after="0"/>
+            </w:pPr>
+            <w:r>
+              <w:rPr>
+                <w:sz w:val="19"/>
+                <w:szCs w:val="19"/>
+              </w:rPr>
+              <w:t xml:space="preserve">Éditeur structuré</w:t>
+            </w:r>
+          </w:p>
+        </w:tc>
+        <w:tc>
+          <w:tcPr>
+            <w:tcW w:type="dxa" w:w="7133"/>
+            <w:tcMar>
+              <w:top w:type="dxa" w:w="60"/>
+              <w:left w:type="dxa" w:w="100"/>
+              <w:bottom w:type="dxa" w:w="60"/>
+              <w:right w:type="dxa" w:w="100"/>
+            </w:tcMar>
+            <w:vAlign w:val="center"/>
+          </w:tcPr>
+          <w:p>
+            <w:pPr>
+              <w:spacing w:after="0"/>
+            </w:pPr>
+            <w:r>
+              <w:rPr>
+                <w:sz w:val="19"/>
+                <w:szCs w:val="19"/>
+              </w:rPr>
+              <w:t xml:space="preserve">Trois types d'exigences (fonctionnelle, non fonctionnelle, user story), onglets par type avec compteurs ; ajout, modification, suppression et réordonnancement</w:t>
+            </w:r>
+          </w:p>
+        </w:tc>
+      </w:tr>
+      <w:tr>
+        <w:tc>
+          <w:tcPr>
+            <w:tcW w:type="dxa" w:w="2505"/>
+            <w:tcMar>
+              <w:top w:type="dxa" w:w="60"/>
+              <w:left w:type="dxa" w:w="100"/>
+              <w:bottom w:type="dxa" w:w="60"/>
+              <w:right w:type="dxa" w:w="100"/>
+            </w:tcMar>
+            <w:vAlign w:val="center"/>
+          </w:tcPr>
+          <w:p>
+            <w:pPr>
+              <w:spacing w:after="0"/>
+            </w:pPr>
+            <w:r>
+              <w:rPr>
+                <w:sz w:val="19"/>
+                <w:szCs w:val="19"/>
+              </w:rPr>
+              <w:t xml:space="preserve">Numérotation automatique</w:t>
+            </w:r>
+          </w:p>
+        </w:tc>
+        <w:tc>
+          <w:tcPr>
+            <w:tcW w:type="dxa" w:w="7133"/>
+            <w:tcMar>
+              <w:top w:type="dxa" w:w="60"/>
+              <w:left w:type="dxa" w:w="100"/>
+              <w:bottom w:type="dxa" w:w="60"/>
+              <w:right w:type="dxa" w:w="100"/>
+            </w:tcMar>
+            <w:vAlign w:val="center"/>
+          </w:tcPr>
+          <w:p>
+            <w:pPr>
+              <w:spacing w:after="0"/>
+            </w:pPr>
+            <w:r>
+              <w:rPr>
+                <w:sz w:val="19"/>
+                <w:szCs w:val="19"/>
+              </w:rPr>
+              <w:t xml:space="preserve">Codes EF-01, ENF-01, US-01 stables (plus grand numéro du type + 1), uniques, préfixe contrôlé par Zod côté serveur</w:t>
+            </w:r>
+          </w:p>
+        </w:tc>
+      </w:tr>
+      <w:tr>
+        <w:tc>
+          <w:tcPr>
+            <w:tcW w:type="dxa" w:w="2505"/>
+            <w:tcMar>
+              <w:top w:type="dxa" w:w="60"/>
+              <w:left w:type="dxa" w:w="100"/>
+              <w:bottom w:type="dxa" w:w="60"/>
+              <w:right w:type="dxa" w:w="100"/>
+            </w:tcMar>
+            <w:vAlign w:val="center"/>
+          </w:tcPr>
+          <w:p>
+            <w:pPr>
+              <w:spacing w:after="0"/>
+            </w:pPr>
+            <w:r>
+              <w:rPr>
+                <w:sz w:val="19"/>
+                <w:szCs w:val="19"/>
+              </w:rPr>
+              <w:t xml:space="preserve">Priorisation</w:t>
+            </w:r>
+          </w:p>
+        </w:tc>
+        <w:tc>
+          <w:tcPr>
+            <w:tcW w:type="dxa" w:w="7133"/>
+            <w:tcMar>
+              <w:top w:type="dxa" w:w="60"/>
+              <w:left w:type="dxa" w:w="100"/>
+              <w:bottom w:type="dxa" w:w="60"/>
+              <w:right w:type="dxa" w:w="100"/>
+            </w:tcMar>
+            <w:vAlign w:val="center"/>
+          </w:tcPr>
+          <w:p>
+            <w:pPr>
+              <w:spacing w:after="0"/>
+            </w:pPr>
+            <w:r>
+              <w:rPr>
+                <w:sz w:val="19"/>
+                <w:szCs w:val="19"/>
+              </w:rPr>
+              <w:t xml:space="preserve">MoSCoW (MUST, SHOULD, COULD, WONT) avec rappel de la signification de chaque niveau</w:t>
+            </w:r>
+          </w:p>
+        </w:tc>
+      </w:tr>
+      <w:tr>
+        <w:tc>
+          <w:tcPr>
+            <w:tcW w:type="dxa" w:w="2505"/>
+            <w:tcMar>
+              <w:top w:type="dxa" w:w="60"/>
+              <w:left w:type="dxa" w:w="100"/>
+              <w:bottom w:type="dxa" w:w="60"/>
+              <w:right w:type="dxa" w:w="100"/>
+            </w:tcMar>
+            <w:vAlign w:val="center"/>
+          </w:tcPr>
+          <w:p>
+            <w:pPr>
+              <w:spacing w:after="0"/>
+            </w:pPr>
+            <w:r>
+              <w:rPr>
+                <w:sz w:val="19"/>
+                <w:szCs w:val="19"/>
+              </w:rPr>
+              <w:t xml:space="preserve">Aide à la rédaction</w:t>
+            </w:r>
+          </w:p>
+        </w:tc>
+        <w:tc>
+          <w:tcPr>
+            <w:tcW w:type="dxa" w:w="7133"/>
+            <w:tcMar>
+              <w:top w:type="dxa" w:w="60"/>
+              <w:left w:type="dxa" w:w="100"/>
+              <w:bottom w:type="dxa" w:w="60"/>
+              <w:right w:type="dxa" w:w="100"/>
+            </w:tcMar>
+            <w:vAlign w:val="center"/>
+          </w:tcPr>
+          <w:p>
+            <w:pPr>
+              <w:spacing w:after="0"/>
+            </w:pPr>
+            <w:r>
+              <w:rPr>
+                <w:sz w:val="19"/>
+                <w:szCs w:val="19"/>
+              </w:rPr>
+              <w:t xml:space="preserve">Modèle « En tant que… je veux… afin de… », alerte si le format n'est pas respecté, critères d'acceptation pour les user stories, conseil adapté à chaque type</w:t>
+            </w:r>
+          </w:p>
+        </w:tc>
+      </w:tr>
+      <w:tr>
+        <w:tc>
+          <w:tcPr>
+            <w:tcW w:type="dxa" w:w="2505"/>
+            <w:tcMar>
+              <w:top w:type="dxa" w:w="60"/>
+              <w:left w:type="dxa" w:w="100"/>
+              <w:bottom w:type="dxa" w:w="60"/>
+              <w:right w:type="dxa" w:w="100"/>
+            </w:tcMar>
+            <w:vAlign w:val="center"/>
+          </w:tcPr>
+          <w:p>
+            <w:pPr>
+              <w:spacing w:after="0"/>
+            </w:pPr>
+            <w:r>
+              <w:rPr>
+                <w:sz w:val="19"/>
+                <w:szCs w:val="19"/>
+              </w:rPr>
+              <w:t xml:space="preserve">Soumission</w:t>
+            </w:r>
+          </w:p>
+        </w:tc>
+        <w:tc>
+          <w:tcPr>
+            <w:tcW w:type="dxa" w:w="7133"/>
+            <w:tcMar>
+              <w:top w:type="dxa" w:w="60"/>
+              <w:left w:type="dxa" w:w="100"/>
+              <w:bottom w:type="dxa" w:w="60"/>
+              <w:right w:type="dxa" w:w="100"/>
+            </w:tcMar>
+            <w:vAlign w:val="center"/>
+          </w:tcPr>
+          <w:p>
+            <w:pPr>
+              <w:spacing w:after="0"/>
+            </w:pPr>
+            <w:r>
+              <w:rPr>
+                <w:sz w:val="19"/>
+                <w:szCs w:val="19"/>
+              </w:rPr>
+              <w:t xml:space="preserve">Le brouillon est verrouillé et figé en version 1 ; il n'évolue ensuite que par une nouvelle version</w:t>
+            </w:r>
+          </w:p>
+        </w:tc>
+      </w:tr>
+      <w:tr>
+        <w:tc>
+          <w:tcPr>
+            <w:tcW w:type="dxa" w:w="2505"/>
+            <w:tcMar>
+              <w:top w:type="dxa" w:w="60"/>
+              <w:left w:type="dxa" w:w="100"/>
+              <w:bottom w:type="dxa" w:w="60"/>
+              <w:right w:type="dxa" w:w="100"/>
+            </w:tcMar>
+            <w:vAlign w:val="center"/>
+          </w:tcPr>
+          <w:p>
+            <w:pPr>
+              <w:spacing w:after="0"/>
+            </w:pPr>
+            <w:r>
+              <w:rPr>
+                <w:sz w:val="19"/>
+                <w:szCs w:val="19"/>
+              </w:rPr>
+              <w:t xml:space="preserve">Évaluation par l'IA</w:t>
+            </w:r>
+          </w:p>
+        </w:tc>
+        <w:tc>
+          <w:tcPr>
+            <w:tcW w:type="dxa" w:w="7133"/>
+            <w:tcMar>
+              <w:top w:type="dxa" w:w="60"/>
+              <w:left w:type="dxa" w:w="100"/>
+              <w:bottom w:type="dxa" w:w="60"/>
+              <w:right w:type="dxa" w:w="100"/>
+            </w:tcMar>
+            <w:vAlign w:val="center"/>
+          </w:tcPr>
+          <w:p>
+            <w:pPr>
+              <w:spacing w:after="0"/>
+            </w:pPr>
+            <w:r>
+              <w:rPr>
+                <w:sz w:val="19"/>
+                <w:szCs w:val="19"/>
+              </w:rPr>
+              <w:t xml:space="preserve">Prompt système v0.2, grille à 6 critères, réponse validée par Zod, note globale recalculée par le serveur, une évaluation par version, historique</w:t>
+            </w:r>
+          </w:p>
+        </w:tc>
+      </w:tr>
+      <w:tr>
+        <w:tc>
+          <w:tcPr>
+            <w:tcW w:type="dxa" w:w="2505"/>
+            <w:tcMar>
+              <w:top w:type="dxa" w:w="60"/>
+              <w:left w:type="dxa" w:w="100"/>
+              <w:bottom w:type="dxa" w:w="60"/>
+              <w:right w:type="dxa" w:w="100"/>
+            </w:tcMar>
+            <w:vAlign w:val="center"/>
+          </w:tcPr>
+          <w:p>
+            <w:pPr>
+              <w:spacing w:after="0"/>
+            </w:pPr>
+            <w:r>
+              <w:rPr>
+                <w:sz w:val="19"/>
+                <w:szCs w:val="19"/>
+              </w:rPr>
+              <w:t xml:space="preserve">Versions successives</w:t>
+            </w:r>
+          </w:p>
+        </w:tc>
+        <w:tc>
+          <w:tcPr>
+            <w:tcW w:type="dxa" w:w="7133"/>
+            <w:tcMar>
+              <w:top w:type="dxa" w:w="60"/>
+              <w:left w:type="dxa" w:w="100"/>
+              <w:bottom w:type="dxa" w:w="60"/>
+              <w:right w:type="dxa" w:w="100"/>
+            </w:tcMar>
+            <w:vAlign w:val="center"/>
+          </w:tcPr>
+          <w:p>
+            <w:pPr>
+              <w:spacing w:after="0"/>
+            </w:pPr>
+            <w:r>
+              <w:rPr>
+                <w:sz w:val="19"/>
+                <w:szCs w:val="19"/>
+              </w:rPr>
+              <w:t xml:space="preserve">Nouvelle version après une demande de changement acceptée ou négociée (décision commune M3/M4) ; historique et consultation du contenu figé de chaque version</w:t>
+            </w:r>
+          </w:p>
+        </w:tc>
+      </w:tr>
+      <w:tr>
+        <w:tc>
+          <w:tcPr>
+            <w:tcW w:type="dxa" w:w="2505"/>
+            <w:tcMar>
+              <w:top w:type="dxa" w:w="60"/>
+              <w:left w:type="dxa" w:w="100"/>
+              <w:bottom w:type="dxa" w:w="60"/>
+              <w:right w:type="dxa" w:w="100"/>
+            </w:tcMar>
+            <w:vAlign w:val="center"/>
+          </w:tcPr>
+          <w:p>
+            <w:pPr>
+              <w:spacing w:after="0"/>
+            </w:pPr>
+            <w:r>
+              <w:rPr>
+                <w:sz w:val="19"/>
+                <w:szCs w:val="19"/>
+              </w:rPr>
+              <w:t xml:space="preserve">Rôles</w:t>
+            </w:r>
+          </w:p>
+        </w:tc>
+        <w:tc>
+          <w:tcPr>
+            <w:tcW w:type="dxa" w:w="7133"/>
+            <w:tcMar>
+              <w:top w:type="dxa" w:w="60"/>
+              <w:left w:type="dxa" w:w="100"/>
+              <w:bottom w:type="dxa" w:w="60"/>
+              <w:right w:type="dxa" w:w="100"/>
+            </w:tcMar>
+            <w:vAlign w:val="center"/>
+          </w:tcPr>
+          <w:p>
+            <w:pPr>
+              <w:spacing w:after="0"/>
+            </w:pPr>
+            <w:r>
+              <w:rPr>
+                <w:sz w:val="19"/>
+                <w:szCs w:val="19"/>
+              </w:rPr>
+              <w:t xml:space="preserve">L'étudiant propriétaire rédige ; l'enseignant consulte tout en lecture seule</w:t>
+            </w:r>
+          </w:p>
+        </w:tc>
+      </w:tr>
+      <w:tr>
+        <w:tc>
+          <w:tcPr>
+            <w:tcW w:type="dxa" w:w="2505"/>
+            <w:tcMar>
+              <w:top w:type="dxa" w:w="60"/>
+              <w:left w:type="dxa" w:w="100"/>
+              <w:bottom w:type="dxa" w:w="60"/>
+              <w:right w:type="dxa" w:w="100"/>
+            </w:tcMar>
+            <w:vAlign w:val="center"/>
+          </w:tcPr>
+          <w:p>
+            <w:pPr>
+              <w:spacing w:after="0"/>
+            </w:pPr>
+            <w:r>
+              <w:rPr>
+                <w:sz w:val="19"/>
+                <w:szCs w:val="19"/>
+              </w:rPr>
+              <w:t xml:space="preserve">Mode sans clé API</w:t>
+            </w:r>
+          </w:p>
+        </w:tc>
+        <w:tc>
+          <w:tcPr>
+            <w:tcW w:type="dxa" w:w="7133"/>
+            <w:tcMar>
+              <w:top w:type="dxa" w:w="60"/>
+              <w:left w:type="dxa" w:w="100"/>
+              <w:bottom w:type="dxa" w:w="60"/>
+              <w:right w:type="dxa" w:w="100"/>
+            </w:tcMar>
+            <w:vAlign w:val="center"/>
+          </w:tcPr>
+          <w:p>
+            <w:pPr>
+              <w:spacing w:after="0"/>
+            </w:pPr>
+            <w:r>
+              <w:rPr>
+                <w:sz w:val="19"/>
+                <w:szCs w:val="19"/>
+              </w:rPr>
+              <w:t xml:space="preserve">Évaluation simulée calculée à partir du contenu réel du cahier des charges</w:t>
+            </w:r>
+          </w:p>
+        </w:tc>
+      </w:tr>
+    </w:tbl>
+    <w:p>
+      <w:pPr>
+        <w:spacing w:before="80" w:after="240"/>
+        <w:jc w:val="center"/>
+      </w:pPr>
+      <w:r>
+        <w:rPr>
+          <w:i/>
+          <w:iCs/>
+          <w:color w:val="5B6474"/>
+          <w:sz w:val="19"/>
+          <w:szCs w:val="19"/>
+        </w:rPr>
+        <w:t xml:space="preserve">Tableau 15 — Fonctionnalités du module 4</w:t>
+      </w:r>
+    </w:p>
+    <w:tbl>
+      <w:tblPr>
+        <w:tblW w:type="dxa" w:w="9638"/>
+        <w:tblBorders>
+          <w:top w:val="single" w:color="auto" w:sz="4"/>
+          <w:left w:val="single" w:color="auto" w:sz="4"/>
+          <w:bottom w:val="single" w:color="auto" w:sz="4"/>
+          <w:right w:val="single" w:color="auto" w:sz="4"/>
+          <w:insideH w:val="single" w:color="auto" w:sz="4"/>
+          <w:insideV w:val="single" w:color="auto" w:sz="4"/>
+        </w:tblBorders>
+      </w:tblPr>
+      <w:tblGrid>
+        <w:gridCol w:w="850"/>
+        <w:gridCol w:w="4300"/>
+        <w:gridCol w:w="1500"/>
+        <w:gridCol w:w="2988"/>
+      </w:tblGrid>
+      <w:tr>
+        <w:trPr>
+          <w:tblHeader/>
+        </w:trPr>
+        <w:tc>
+          <w:tcPr>
+            <w:tcW w:type="dxa" w:w="850"/>
+            <w:shd w:fill="B3261E" w:color="auto" w:val="clear"/>
+            <w:tcMar>
+              <w:top w:type="dxa" w:w="60"/>
+              <w:left w:type="dxa" w:w="100"/>
+              <w:bottom w:type="dxa" w:w="60"/>
+              <w:right w:type="dxa" w:w="100"/>
+            </w:tcMar>
+            <w:vAlign w:val="center"/>
+          </w:tcPr>
+          <w:p>
+            <w:pPr>
+              <w:spacing w:after="0"/>
+            </w:pPr>
+            <w:r>
+              <w:rPr>
+                <w:b/>
+                <w:bCs/>
+                <w:color w:val="FFFFFF"/>
+                <w:sz w:val="19"/>
+                <w:szCs w:val="19"/>
+              </w:rPr>
+              <w:t xml:space="preserve">Méthode</w:t>
+            </w:r>
+          </w:p>
+        </w:tc>
+        <w:tc>
+          <w:tcPr>
+            <w:tcW w:type="dxa" w:w="4300"/>
+            <w:shd w:fill="B3261E" w:color="auto" w:val="clear"/>
+            <w:tcMar>
+              <w:top w:type="dxa" w:w="60"/>
+              <w:left w:type="dxa" w:w="100"/>
+              <w:bottom w:type="dxa" w:w="60"/>
+              <w:right w:type="dxa" w:w="100"/>
+            </w:tcMar>
+            <w:vAlign w:val="center"/>
+          </w:tcPr>
+          <w:p>
+            <w:pPr>
+              <w:spacing w:after="0"/>
+            </w:pPr>
+            <w:r>
+              <w:rPr>
+                <w:b/>
+                <w:bCs/>
+                <w:color w:val="FFFFFF"/>
+                <w:sz w:val="19"/>
+                <w:szCs w:val="19"/>
+              </w:rPr>
+              <w:t xml:space="preserve">Route</w:t>
+            </w:r>
+          </w:p>
+        </w:tc>
+        <w:tc>
+          <w:tcPr>
+            <w:tcW w:type="dxa" w:w="1500"/>
+            <w:shd w:fill="B3261E" w:color="auto" w:val="clear"/>
+            <w:tcMar>
+              <w:top w:type="dxa" w:w="60"/>
+              <w:left w:type="dxa" w:w="100"/>
+              <w:bottom w:type="dxa" w:w="60"/>
+              <w:right w:type="dxa" w:w="100"/>
+            </w:tcMar>
+            <w:vAlign w:val="center"/>
+          </w:tcPr>
+          <w:p>
+            <w:pPr>
+              <w:spacing w:after="0"/>
+            </w:pPr>
+            <w:r>
+              <w:rPr>
+                <w:b/>
+                <w:bCs/>
+                <w:color w:val="FFFFFF"/>
+                <w:sz w:val="19"/>
+                <w:szCs w:val="19"/>
+              </w:rPr>
+              <w:t xml:space="preserve">Rôle</w:t>
+            </w:r>
+          </w:p>
+        </w:tc>
+        <w:tc>
+          <w:tcPr>
+            <w:tcW w:type="dxa" w:w="2988"/>
+            <w:shd w:fill="B3261E" w:color="auto" w:val="clear"/>
+            <w:tcMar>
+              <w:top w:type="dxa" w:w="60"/>
+              <w:left w:type="dxa" w:w="100"/>
+              <w:bottom w:type="dxa" w:w="60"/>
+              <w:right w:type="dxa" w:w="100"/>
+            </w:tcMar>
+            <w:vAlign w:val="center"/>
+          </w:tcPr>
+          <w:p>
+            <w:pPr>
+              <w:spacing w:after="0"/>
+            </w:pPr>
+            <w:r>
+              <w:rPr>
+                <w:b/>
+                <w:bCs/>
+                <w:color w:val="FFFFFF"/>
+                <w:sz w:val="19"/>
+                <w:szCs w:val="19"/>
+              </w:rPr>
+              <w:t xml:space="preserve">Rôle de l'endpoint</w:t>
+            </w:r>
+          </w:p>
+        </w:tc>
+      </w:tr>
+      <w:tr>
+        <w:tc>
+          <w:tcPr>
+            <w:tcW w:type="dxa" w:w="850"/>
+            <w:tcMar>
+              <w:top w:type="dxa" w:w="60"/>
+              <w:left w:type="dxa" w:w="100"/>
+              <w:bottom w:type="dxa" w:w="60"/>
+              <w:right w:type="dxa" w:w="100"/>
+            </w:tcMar>
+            <w:vAlign w:val="center"/>
+          </w:tcPr>
+          <w:p>
+            <w:pPr>
+              <w:spacing w:after="0"/>
+            </w:pPr>
+            <w:r>
+              <w:rPr>
+                <w:sz w:val="19"/>
+                <w:szCs w:val="19"/>
+              </w:rPr>
+              <w:t xml:space="preserve">GET</w:t>
+            </w:r>
+          </w:p>
+        </w:tc>
+        <w:tc>
+          <w:tcPr>
+            <w:tcW w:type="dxa" w:w="4300"/>
+            <w:tcMar>
+              <w:top w:type="dxa" w:w="60"/>
+              <w:left w:type="dxa" w:w="100"/>
+              <w:bottom w:type="dxa" w:w="60"/>
+              <w:right w:type="dxa" w:w="100"/>
+            </w:tcMar>
+            <w:vAlign w:val="center"/>
+          </w:tcPr>
+          <w:p>
+            <w:pPr>
+              <w:spacing w:after="0"/>
+            </w:pPr>
+            <w:r>
+              <w:rPr>
+                <w:sz w:val="19"/>
+                <w:szCs w:val="19"/>
+              </w:rPr>
+              <w:t xml:space="preserve">/api/requirements/sessions/:sessionId/document</w:t>
+            </w:r>
+          </w:p>
+        </w:tc>
+        <w:tc>
+          <w:tcPr>
+            <w:tcW w:type="dxa" w:w="1500"/>
+            <w:tcMar>
+              <w:top w:type="dxa" w:w="60"/>
+              <w:left w:type="dxa" w:w="100"/>
+              <w:bottom w:type="dxa" w:w="60"/>
+              <w:right w:type="dxa" w:w="100"/>
+            </w:tcMar>
+            <w:vAlign w:val="center"/>
+          </w:tcPr>
+          <w:p>
+            <w:pPr>
+              <w:spacing w:after="0"/>
+            </w:pPr>
+            <w:r>
+              <w:rPr>
+                <w:sz w:val="19"/>
+                <w:szCs w:val="19"/>
+              </w:rPr>
+              <w:t xml:space="preserve">propriétaire ou enseignant</w:t>
+            </w:r>
+          </w:p>
+        </w:tc>
+        <w:tc>
+          <w:tcPr>
+            <w:tcW w:type="dxa" w:w="2988"/>
+            <w:tcMar>
+              <w:top w:type="dxa" w:w="60"/>
+              <w:left w:type="dxa" w:w="100"/>
+              <w:bottom w:type="dxa" w:w="60"/>
+              <w:right w:type="dxa" w:w="100"/>
+            </w:tcMar>
+            <w:vAlign w:val="center"/>
+          </w:tcPr>
+          <w:p>
+            <w:pPr>
+              <w:spacing w:after="0"/>
+            </w:pPr>
+            <w:r>
+              <w:rPr>
+                <w:sz w:val="19"/>
+                <w:szCs w:val="19"/>
+              </w:rPr>
+              <w:t xml:space="preserve">Cahier des charges (créé vide au premier accès), statut et version courante</w:t>
+            </w:r>
+          </w:p>
+        </w:tc>
+      </w:tr>
+      <w:tr>
+        <w:tc>
+          <w:tcPr>
+            <w:tcW w:type="dxa" w:w="850"/>
+            <w:tcMar>
+              <w:top w:type="dxa" w:w="60"/>
+              <w:left w:type="dxa" w:w="100"/>
+              <w:bottom w:type="dxa" w:w="60"/>
+              <w:right w:type="dxa" w:w="100"/>
+            </w:tcMar>
+            <w:vAlign w:val="center"/>
+          </w:tcPr>
+          <w:p>
+            <w:pPr>
+              <w:spacing w:after="0"/>
+            </w:pPr>
+            <w:r>
+              <w:rPr>
+                <w:sz w:val="19"/>
+                <w:szCs w:val="19"/>
+              </w:rPr>
+              <w:t xml:space="preserve">PUT</w:t>
+            </w:r>
+          </w:p>
+        </w:tc>
+        <w:tc>
+          <w:tcPr>
+            <w:tcW w:type="dxa" w:w="4300"/>
+            <w:tcMar>
+              <w:top w:type="dxa" w:w="60"/>
+              <w:left w:type="dxa" w:w="100"/>
+              <w:bottom w:type="dxa" w:w="60"/>
+              <w:right w:type="dxa" w:w="100"/>
+            </w:tcMar>
+            <w:vAlign w:val="center"/>
+          </w:tcPr>
+          <w:p>
+            <w:pPr>
+              <w:spacing w:after="0"/>
+            </w:pPr>
+            <w:r>
+              <w:rPr>
+                <w:sz w:val="19"/>
+                <w:szCs w:val="19"/>
+              </w:rPr>
+              <w:t xml:space="preserve">/api/requirements/sessions/:sessionId/document</w:t>
+            </w:r>
+          </w:p>
+        </w:tc>
+        <w:tc>
+          <w:tcPr>
+            <w:tcW w:type="dxa" w:w="1500"/>
+            <w:tcMar>
+              <w:top w:type="dxa" w:w="60"/>
+              <w:left w:type="dxa" w:w="100"/>
+              <w:bottom w:type="dxa" w:w="60"/>
+              <w:right w:type="dxa" w:w="100"/>
+            </w:tcMar>
+            <w:vAlign w:val="center"/>
+          </w:tcPr>
+          <w:p>
+            <w:pPr>
+              <w:spacing w:after="0"/>
+            </w:pPr>
+            <w:r>
+              <w:rPr>
+                <w:sz w:val="19"/>
+                <w:szCs w:val="19"/>
+              </w:rPr>
+              <w:t xml:space="preserve">étudiant propriétaire</w:t>
+            </w:r>
+          </w:p>
+        </w:tc>
+        <w:tc>
+          <w:tcPr>
+            <w:tcW w:type="dxa" w:w="2988"/>
+            <w:tcMar>
+              <w:top w:type="dxa" w:w="60"/>
+              <w:left w:type="dxa" w:w="100"/>
+              <w:bottom w:type="dxa" w:w="60"/>
+              <w:right w:type="dxa" w:w="100"/>
+            </w:tcMar>
+            <w:vAlign w:val="center"/>
+          </w:tcPr>
+          <w:p>
+            <w:pPr>
+              <w:spacing w:after="0"/>
+            </w:pPr>
+            <w:r>
+              <w:rPr>
+                <w:sz w:val="19"/>
+                <w:szCs w:val="19"/>
+              </w:rPr>
+              <w:t xml:space="preserve">Enregistre le brouillon ; 409 s'il est déjà soumis</w:t>
+            </w:r>
+          </w:p>
+        </w:tc>
+      </w:tr>
+      <w:tr>
+        <w:tc>
+          <w:tcPr>
+            <w:tcW w:type="dxa" w:w="850"/>
+            <w:tcMar>
+              <w:top w:type="dxa" w:w="60"/>
+              <w:left w:type="dxa" w:w="100"/>
+              <w:bottom w:type="dxa" w:w="60"/>
+              <w:right w:type="dxa" w:w="100"/>
+            </w:tcMar>
+            <w:vAlign w:val="center"/>
+          </w:tcPr>
+          <w:p>
+            <w:pPr>
+              <w:spacing w:after="0"/>
+            </w:pPr>
+            <w:r>
+              <w:rPr>
+                <w:sz w:val="19"/>
+                <w:szCs w:val="19"/>
+              </w:rPr>
+              <w:t xml:space="preserve">POST</w:t>
+            </w:r>
+          </w:p>
+        </w:tc>
+        <w:tc>
+          <w:tcPr>
+            <w:tcW w:type="dxa" w:w="4300"/>
+            <w:tcMar>
+              <w:top w:type="dxa" w:w="60"/>
+              <w:left w:type="dxa" w:w="100"/>
+              <w:bottom w:type="dxa" w:w="60"/>
+              <w:right w:type="dxa" w:w="100"/>
+            </w:tcMar>
+            <w:vAlign w:val="center"/>
+          </w:tcPr>
+          <w:p>
+            <w:pPr>
+              <w:spacing w:after="0"/>
+            </w:pPr>
+            <w:r>
+              <w:rPr>
+                <w:sz w:val="19"/>
+                <w:szCs w:val="19"/>
+              </w:rPr>
+              <w:t xml:space="preserve">/api/requirements/sessions/:sessionId/document/submit</w:t>
+            </w:r>
+          </w:p>
+        </w:tc>
+        <w:tc>
+          <w:tcPr>
+            <w:tcW w:type="dxa" w:w="1500"/>
+            <w:tcMar>
+              <w:top w:type="dxa" w:w="60"/>
+              <w:left w:type="dxa" w:w="100"/>
+              <w:bottom w:type="dxa" w:w="60"/>
+              <w:right w:type="dxa" w:w="100"/>
+            </w:tcMar>
+            <w:vAlign w:val="center"/>
+          </w:tcPr>
+          <w:p>
+            <w:pPr>
+              <w:spacing w:after="0"/>
+            </w:pPr>
+            <w:r>
+              <w:rPr>
+                <w:sz w:val="19"/>
+                <w:szCs w:val="19"/>
+              </w:rPr>
+              <w:t xml:space="preserve">étudiant propriétaire</w:t>
+            </w:r>
+          </w:p>
+        </w:tc>
+        <w:tc>
+          <w:tcPr>
+            <w:tcW w:type="dxa" w:w="2988"/>
+            <w:tcMar>
+              <w:top w:type="dxa" w:w="60"/>
+              <w:left w:type="dxa" w:w="100"/>
+              <w:bottom w:type="dxa" w:w="60"/>
+              <w:right w:type="dxa" w:w="100"/>
+            </w:tcMar>
+            <w:vAlign w:val="center"/>
+          </w:tcPr>
+          <w:p>
+            <w:pPr>
+              <w:spacing w:after="0"/>
+            </w:pPr>
+            <w:r>
+              <w:rPr>
+                <w:sz w:val="19"/>
+                <w:szCs w:val="19"/>
+              </w:rPr>
+              <w:t xml:space="preserve">Soumet le brouillon et crée la version 1</w:t>
+            </w:r>
+          </w:p>
+        </w:tc>
+      </w:tr>
+      <w:tr>
+        <w:tc>
+          <w:tcPr>
+            <w:tcW w:type="dxa" w:w="850"/>
+            <w:tcMar>
+              <w:top w:type="dxa" w:w="60"/>
+              <w:left w:type="dxa" w:w="100"/>
+              <w:bottom w:type="dxa" w:w="60"/>
+              <w:right w:type="dxa" w:w="100"/>
+            </w:tcMar>
+            <w:vAlign w:val="center"/>
+          </w:tcPr>
+          <w:p>
+            <w:pPr>
+              <w:spacing w:after="0"/>
+            </w:pPr>
+            <w:r>
+              <w:rPr>
+                <w:sz w:val="19"/>
+                <w:szCs w:val="19"/>
+              </w:rPr>
+              <w:t xml:space="preserve">POST</w:t>
+            </w:r>
+          </w:p>
+        </w:tc>
+        <w:tc>
+          <w:tcPr>
+            <w:tcW w:type="dxa" w:w="4300"/>
+            <w:tcMar>
+              <w:top w:type="dxa" w:w="60"/>
+              <w:left w:type="dxa" w:w="100"/>
+              <w:bottom w:type="dxa" w:w="60"/>
+              <w:right w:type="dxa" w:w="100"/>
+            </w:tcMar>
+            <w:vAlign w:val="center"/>
+          </w:tcPr>
+          <w:p>
+            <w:pPr>
+              <w:spacing w:after="0"/>
+            </w:pPr>
+            <w:r>
+              <w:rPr>
+                <w:sz w:val="19"/>
+                <w:szCs w:val="19"/>
+              </w:rPr>
+              <w:t xml:space="preserve">/api/requirements/sessions/:sessionId/document/evaluate</w:t>
+            </w:r>
+          </w:p>
+        </w:tc>
+        <w:tc>
+          <w:tcPr>
+            <w:tcW w:type="dxa" w:w="1500"/>
+            <w:tcMar>
+              <w:top w:type="dxa" w:w="60"/>
+              <w:left w:type="dxa" w:w="100"/>
+              <w:bottom w:type="dxa" w:w="60"/>
+              <w:right w:type="dxa" w:w="100"/>
+            </w:tcMar>
+            <w:vAlign w:val="center"/>
+          </w:tcPr>
+          <w:p>
+            <w:pPr>
+              <w:spacing w:after="0"/>
+            </w:pPr>
+            <w:r>
+              <w:rPr>
+                <w:sz w:val="19"/>
+                <w:szCs w:val="19"/>
+              </w:rPr>
+              <w:t xml:space="preserve">étudiant propriétaire</w:t>
+            </w:r>
+          </w:p>
+        </w:tc>
+        <w:tc>
+          <w:tcPr>
+            <w:tcW w:type="dxa" w:w="2988"/>
+            <w:tcMar>
+              <w:top w:type="dxa" w:w="60"/>
+              <w:left w:type="dxa" w:w="100"/>
+              <w:bottom w:type="dxa" w:w="60"/>
+              <w:right w:type="dxa" w:w="100"/>
+            </w:tcMar>
+            <w:vAlign w:val="center"/>
+          </w:tcPr>
+          <w:p>
+            <w:pPr>
+              <w:spacing w:after="0"/>
+            </w:pPr>
+            <w:r>
+              <w:rPr>
+                <w:sz w:val="19"/>
+                <w:szCs w:val="19"/>
+              </w:rPr>
+              <w:t xml:space="preserve">Évalue la version courante avec le LLM</w:t>
+            </w:r>
+          </w:p>
+        </w:tc>
+      </w:tr>
+      <w:tr>
+        <w:tc>
+          <w:tcPr>
+            <w:tcW w:type="dxa" w:w="850"/>
+            <w:tcMar>
+              <w:top w:type="dxa" w:w="60"/>
+              <w:left w:type="dxa" w:w="100"/>
+              <w:bottom w:type="dxa" w:w="60"/>
+              <w:right w:type="dxa" w:w="100"/>
+            </w:tcMar>
+            <w:vAlign w:val="center"/>
+          </w:tcPr>
+          <w:p>
+            <w:pPr>
+              <w:spacing w:after="0"/>
+            </w:pPr>
+            <w:r>
+              <w:rPr>
+                <w:sz w:val="19"/>
+                <w:szCs w:val="19"/>
+              </w:rPr>
+              <w:t xml:space="preserve">GET</w:t>
+            </w:r>
+          </w:p>
+        </w:tc>
+        <w:tc>
+          <w:tcPr>
+            <w:tcW w:type="dxa" w:w="4300"/>
+            <w:tcMar>
+              <w:top w:type="dxa" w:w="60"/>
+              <w:left w:type="dxa" w:w="100"/>
+              <w:bottom w:type="dxa" w:w="60"/>
+              <w:right w:type="dxa" w:w="100"/>
+            </w:tcMar>
+            <w:vAlign w:val="center"/>
+          </w:tcPr>
+          <w:p>
+            <w:pPr>
+              <w:spacing w:after="0"/>
+            </w:pPr>
+            <w:r>
+              <w:rPr>
+                <w:sz w:val="19"/>
+                <w:szCs w:val="19"/>
+              </w:rPr>
+              <w:t xml:space="preserve">/api/requirements/sessions/:sessionId/document/evaluations</w:t>
+            </w:r>
+          </w:p>
+        </w:tc>
+        <w:tc>
+          <w:tcPr>
+            <w:tcW w:type="dxa" w:w="1500"/>
+            <w:tcMar>
+              <w:top w:type="dxa" w:w="60"/>
+              <w:left w:type="dxa" w:w="100"/>
+              <w:bottom w:type="dxa" w:w="60"/>
+              <w:right w:type="dxa" w:w="100"/>
+            </w:tcMar>
+            <w:vAlign w:val="center"/>
+          </w:tcPr>
+          <w:p>
+            <w:pPr>
+              <w:spacing w:after="0"/>
+            </w:pPr>
+            <w:r>
+              <w:rPr>
+                <w:sz w:val="19"/>
+                <w:szCs w:val="19"/>
+              </w:rPr>
+              <w:t xml:space="preserve">propriétaire ou enseignant</w:t>
+            </w:r>
+          </w:p>
+        </w:tc>
+        <w:tc>
+          <w:tcPr>
+            <w:tcW w:type="dxa" w:w="2988"/>
+            <w:tcMar>
+              <w:top w:type="dxa" w:w="60"/>
+              <w:left w:type="dxa" w:w="100"/>
+              <w:bottom w:type="dxa" w:w="60"/>
+              <w:right w:type="dxa" w:w="100"/>
+            </w:tcMar>
+            <w:vAlign w:val="center"/>
+          </w:tcPr>
+          <w:p>
+            <w:pPr>
+              <w:spacing w:after="0"/>
+            </w:pPr>
+            <w:r>
+              <w:rPr>
+                <w:sz w:val="19"/>
+                <w:szCs w:val="19"/>
+              </w:rPr>
+              <w:t xml:space="preserve">Historique des évaluations</w:t>
+            </w:r>
+          </w:p>
+        </w:tc>
+      </w:tr>
+      <w:tr>
+        <w:tc>
+          <w:tcPr>
+            <w:tcW w:type="dxa" w:w="850"/>
+            <w:tcMar>
+              <w:top w:type="dxa" w:w="60"/>
+              <w:left w:type="dxa" w:w="100"/>
+              <w:bottom w:type="dxa" w:w="60"/>
+              <w:right w:type="dxa" w:w="100"/>
+            </w:tcMar>
+            <w:vAlign w:val="center"/>
+          </w:tcPr>
+          <w:p>
+            <w:pPr>
+              <w:spacing w:after="0"/>
+            </w:pPr>
+            <w:r>
+              <w:rPr>
+                <w:sz w:val="19"/>
+                <w:szCs w:val="19"/>
+              </w:rPr>
+              <w:t xml:space="preserve">POST</w:t>
+            </w:r>
+          </w:p>
+        </w:tc>
+        <w:tc>
+          <w:tcPr>
+            <w:tcW w:type="dxa" w:w="4300"/>
+            <w:tcMar>
+              <w:top w:type="dxa" w:w="60"/>
+              <w:left w:type="dxa" w:w="100"/>
+              <w:bottom w:type="dxa" w:w="60"/>
+              <w:right w:type="dxa" w:w="100"/>
+            </w:tcMar>
+            <w:vAlign w:val="center"/>
+          </w:tcPr>
+          <w:p>
+            <w:pPr>
+              <w:spacing w:after="0"/>
+            </w:pPr>
+            <w:r>
+              <w:rPr>
+                <w:sz w:val="19"/>
+                <w:szCs w:val="19"/>
+              </w:rPr>
+              <w:t xml:space="preserve">/api/requirements/sessions/:sessionId/document/versions</w:t>
+            </w:r>
+          </w:p>
+        </w:tc>
+        <w:tc>
+          <w:tcPr>
+            <w:tcW w:type="dxa" w:w="1500"/>
+            <w:tcMar>
+              <w:top w:type="dxa" w:w="60"/>
+              <w:left w:type="dxa" w:w="100"/>
+              <w:bottom w:type="dxa" w:w="60"/>
+              <w:right w:type="dxa" w:w="100"/>
+            </w:tcMar>
+            <w:vAlign w:val="center"/>
+          </w:tcPr>
+          <w:p>
+            <w:pPr>
+              <w:spacing w:after="0"/>
+            </w:pPr>
+            <w:r>
+              <w:rPr>
+                <w:sz w:val="19"/>
+                <w:szCs w:val="19"/>
+              </w:rPr>
+              <w:t xml:space="preserve">étudiant propriétaire</w:t>
+            </w:r>
+          </w:p>
+        </w:tc>
+        <w:tc>
+          <w:tcPr>
+            <w:tcW w:type="dxa" w:w="2988"/>
+            <w:tcMar>
+              <w:top w:type="dxa" w:w="60"/>
+              <w:left w:type="dxa" w:w="100"/>
+              <w:bottom w:type="dxa" w:w="60"/>
+              <w:right w:type="dxa" w:w="100"/>
+            </w:tcMar>
+            <w:vAlign w:val="center"/>
+          </w:tcPr>
+          <w:p>
+            <w:pPr>
+              <w:spacing w:after="0"/>
+            </w:pPr>
+            <w:r>
+              <w:rPr>
+                <w:sz w:val="19"/>
+                <w:szCs w:val="19"/>
+              </w:rPr>
+              <w:t xml:space="preserve">Crée la version suivante après une demande de changement acceptée ou négociée</w:t>
+            </w:r>
+          </w:p>
+        </w:tc>
+      </w:tr>
+      <w:tr>
+        <w:tc>
+          <w:tcPr>
+            <w:tcW w:type="dxa" w:w="850"/>
+            <w:tcMar>
+              <w:top w:type="dxa" w:w="60"/>
+              <w:left w:type="dxa" w:w="100"/>
+              <w:bottom w:type="dxa" w:w="60"/>
+              <w:right w:type="dxa" w:w="100"/>
+            </w:tcMar>
+            <w:vAlign w:val="center"/>
+          </w:tcPr>
+          <w:p>
+            <w:pPr>
+              <w:spacing w:after="0"/>
+            </w:pPr>
+            <w:r>
+              <w:rPr>
+                <w:sz w:val="19"/>
+                <w:szCs w:val="19"/>
+              </w:rPr>
+              <w:t xml:space="preserve">GET</w:t>
+            </w:r>
+          </w:p>
+        </w:tc>
+        <w:tc>
+          <w:tcPr>
+            <w:tcW w:type="dxa" w:w="4300"/>
+            <w:tcMar>
+              <w:top w:type="dxa" w:w="60"/>
+              <w:left w:type="dxa" w:w="100"/>
+              <w:bottom w:type="dxa" w:w="60"/>
+              <w:right w:type="dxa" w:w="100"/>
+            </w:tcMar>
+            <w:vAlign w:val="center"/>
+          </w:tcPr>
+          <w:p>
+            <w:pPr>
+              <w:spacing w:after="0"/>
+            </w:pPr>
+            <w:r>
+              <w:rPr>
+                <w:sz w:val="19"/>
+                <w:szCs w:val="19"/>
+              </w:rPr>
+              <w:t xml:space="preserve">/api/requirements/sessions/:sessionId/document/versions</w:t>
+            </w:r>
+          </w:p>
+        </w:tc>
+        <w:tc>
+          <w:tcPr>
+            <w:tcW w:type="dxa" w:w="1500"/>
+            <w:tcMar>
+              <w:top w:type="dxa" w:w="60"/>
+              <w:left w:type="dxa" w:w="100"/>
+              <w:bottom w:type="dxa" w:w="60"/>
+              <w:right w:type="dxa" w:w="100"/>
+            </w:tcMar>
+            <w:vAlign w:val="center"/>
+          </w:tcPr>
+          <w:p>
+            <w:pPr>
+              <w:spacing w:after="0"/>
+            </w:pPr>
+            <w:r>
+              <w:rPr>
+                <w:sz w:val="19"/>
+                <w:szCs w:val="19"/>
+              </w:rPr>
+              <w:t xml:space="preserve">propriétaire ou enseignant</w:t>
+            </w:r>
+          </w:p>
+        </w:tc>
+        <w:tc>
+          <w:tcPr>
+            <w:tcW w:type="dxa" w:w="2988"/>
+            <w:tcMar>
+              <w:top w:type="dxa" w:w="60"/>
+              <w:left w:type="dxa" w:w="100"/>
+              <w:bottom w:type="dxa" w:w="60"/>
+              <w:right w:type="dxa" w:w="100"/>
+            </w:tcMar>
+            <w:vAlign w:val="center"/>
+          </w:tcPr>
+          <w:p>
+            <w:pPr>
+              <w:spacing w:after="0"/>
+            </w:pPr>
+            <w:r>
+              <w:rPr>
+                <w:sz w:val="19"/>
+                <w:szCs w:val="19"/>
+              </w:rPr>
+              <w:t xml:space="preserve">Liste des versions, filtrable par demande de changement (utilisée par le module 3)</w:t>
+            </w:r>
+          </w:p>
+        </w:tc>
+      </w:tr>
+      <w:tr>
+        <w:tc>
+          <w:tcPr>
+            <w:tcW w:type="dxa" w:w="850"/>
+            <w:tcMar>
+              <w:top w:type="dxa" w:w="60"/>
+              <w:left w:type="dxa" w:w="100"/>
+              <w:bottom w:type="dxa" w:w="60"/>
+              <w:right w:type="dxa" w:w="100"/>
+            </w:tcMar>
+            <w:vAlign w:val="center"/>
+          </w:tcPr>
+          <w:p>
+            <w:pPr>
+              <w:spacing w:after="0"/>
+            </w:pPr>
+            <w:r>
+              <w:rPr>
+                <w:sz w:val="19"/>
+                <w:szCs w:val="19"/>
+              </w:rPr>
+              <w:t xml:space="preserve">GET</w:t>
+            </w:r>
+          </w:p>
+        </w:tc>
+        <w:tc>
+          <w:tcPr>
+            <w:tcW w:type="dxa" w:w="4300"/>
+            <w:tcMar>
+              <w:top w:type="dxa" w:w="60"/>
+              <w:left w:type="dxa" w:w="100"/>
+              <w:bottom w:type="dxa" w:w="60"/>
+              <w:right w:type="dxa" w:w="100"/>
+            </w:tcMar>
+            <w:vAlign w:val="center"/>
+          </w:tcPr>
+          <w:p>
+            <w:pPr>
+              <w:spacing w:after="0"/>
+            </w:pPr>
+            <w:r>
+              <w:rPr>
+                <w:sz w:val="19"/>
+                <w:szCs w:val="19"/>
+              </w:rPr>
+              <w:t xml:space="preserve">/api/requirements/sessions/:sessionId/document/versions/:version</w:t>
+            </w:r>
+          </w:p>
+        </w:tc>
+        <w:tc>
+          <w:tcPr>
+            <w:tcW w:type="dxa" w:w="1500"/>
+            <w:tcMar>
+              <w:top w:type="dxa" w:w="60"/>
+              <w:left w:type="dxa" w:w="100"/>
+              <w:bottom w:type="dxa" w:w="60"/>
+              <w:right w:type="dxa" w:w="100"/>
+            </w:tcMar>
+            <w:vAlign w:val="center"/>
+          </w:tcPr>
+          <w:p>
+            <w:pPr>
+              <w:spacing w:after="0"/>
+            </w:pPr>
+            <w:r>
+              <w:rPr>
+                <w:sz w:val="19"/>
+                <w:szCs w:val="19"/>
+              </w:rPr>
+              <w:t xml:space="preserve">propriétaire ou enseignant</w:t>
+            </w:r>
+          </w:p>
+        </w:tc>
+        <w:tc>
+          <w:tcPr>
+            <w:tcW w:type="dxa" w:w="2988"/>
+            <w:tcMar>
+              <w:top w:type="dxa" w:w="60"/>
+              <w:left w:type="dxa" w:w="100"/>
+              <w:bottom w:type="dxa" w:w="60"/>
+              <w:right w:type="dxa" w:w="100"/>
+            </w:tcMar>
+            <w:vAlign w:val="center"/>
+          </w:tcPr>
+          <w:p>
+            <w:pPr>
+              <w:spacing w:after="0"/>
+            </w:pPr>
+            <w:r>
+              <w:rPr>
+                <w:sz w:val="19"/>
+                <w:szCs w:val="19"/>
+              </w:rPr>
+              <w:t xml:space="preserve">Contenu figé d'une version</w:t>
+            </w:r>
+          </w:p>
+        </w:tc>
+      </w:tr>
+    </w:tbl>
+    <w:p>
+      <w:pPr>
+        <w:spacing w:before="80" w:after="240"/>
+        <w:jc w:val="center"/>
+      </w:pPr>
+      <w:r>
+        <w:rPr>
+          <w:i/>
+          <w:iCs/>
+          <w:color w:val="5B6474"/>
+          <w:sz w:val="19"/>
+          <w:szCs w:val="19"/>
+        </w:rPr>
+        <w:t xml:space="preserve">Tableau 16 — Endpoints du module 4</w:t>
+      </w:r>
+    </w:p>
+    <w:p>
+      <w:pPr>
+        <w:spacing w:after="120" w:line="300"/>
+        <w:jc w:val="both"/>
+      </w:pPr>
+      <w:r>
+        <w:t xml:space="preserve">Le document suit le cycle </w:t>
+      </w:r>
+      <w:r>
+        <w:rPr>
+          <w:b/>
+          <w:bCs/>
+        </w:rPr>
+        <w:t xml:space="preserve">Brouillon → Soumis (version 1) → Évalué</w:t>
+      </w:r>
+      <w:r>
+        <w:t xml:space="preserve">. Une demande de changement acceptée ou négociée permet d'enregistrer la version suivante, qui repasse au statut Soumis et peut être réévaluée. Le serveur vérifie lui-même la demande (même séance, réponse ACCEPT ou NEGOTIATE, pas déjà utilisée) : il ne se fie jamais au paramètre transmis dans l'URL.</w:t>
+      </w:r>
+    </w:p>
+    <w:p>
+      <w:pPr>
+        <w:spacing w:after="120" w:line="300"/>
+        <w:jc w:val="both"/>
+      </w:pPr>
+      <w:r>
+        <w:t xml:space="preserve">Cette fonctionnalité touche deux modules et la base de données. Avant tout code, les responsables des modules 3 et 4 ont arrêté une solution commune, validée par le chef de projet : une table </w:t>
+      </w:r>
+      <w:r>
+        <w:rPr>
+          <w:rFonts w:ascii="Consolas" w:cs="Consolas" w:eastAsia="Consolas" w:hAnsi="Consolas"/>
+          <w:color w:val="8C1D18"/>
+          <w:sz w:val="19"/>
+          <w:szCs w:val="19"/>
+        </w:rPr>
+        <w:t xml:space="preserve">RequirementsDocumentVersion</w:t>
+      </w:r>
+      <w:r>
+        <w:t xml:space="preserve"> propriété du module 4 et seulement lue par le module 3, un champ </w:t>
+      </w:r>
+      <w:r>
+        <w:rPr>
+          <w:rFonts w:ascii="Consolas" w:cs="Consolas" w:eastAsia="Consolas" w:hAnsi="Consolas"/>
+          <w:color w:val="8C1D18"/>
+          <w:sz w:val="19"/>
+          <w:szCs w:val="19"/>
+        </w:rPr>
+        <w:t xml:space="preserve">version</w:t>
+      </w:r>
+      <w:r>
+        <w:t xml:space="preserve"> dans </w:t>
+      </w:r>
+      <w:r>
+        <w:rPr>
+          <w:rFonts w:ascii="Consolas" w:cs="Consolas" w:eastAsia="Consolas" w:hAnsi="Consolas"/>
+          <w:color w:val="8C1D18"/>
+          <w:sz w:val="19"/>
+          <w:szCs w:val="19"/>
+        </w:rPr>
+        <w:t xml:space="preserve">RequirementsEvaluation</w:t>
+      </w:r>
+      <w:r>
+        <w:t xml:space="preserve">, et une seule migration (</w:t>
+      </w:r>
+      <w:r>
+        <w:rPr>
+          <w:rFonts w:ascii="Consolas" w:cs="Consolas" w:eastAsia="Consolas" w:hAnsi="Consolas"/>
+          <w:color w:val="8C1D18"/>
+          <w:sz w:val="19"/>
+          <w:szCs w:val="19"/>
+        </w:rPr>
+        <w:t xml:space="preserve">ajout_versions_cahier</w:t>
+      </w:r>
+      <w:r>
+        <w:t xml:space="preserve">), livrée en premier dans un commit séparé pour débloquer le module 3.</w:t>
+      </w:r>
+    </w:p>
+    <w:p>
+      <w:pPr>
+        <w:pStyle w:val="Heading3"/>
+      </w:pPr>
+      <w:r>
+        <w:t xml:space="preserve">Prompts utilisés</w:t>
+      </w:r>
+    </w:p>
+    <w:p>
+      <w:pPr>
+        <w:spacing w:after="120" w:line="300"/>
+        <w:jc w:val="both"/>
+      </w:pPr>
+      <w:r>
+        <w:t xml:space="preserve">Comme pour le module 1, deux types de prompts interviennent : le prompt de développement adressé à l'assistant (journal </w:t>
+      </w:r>
+      <w:r>
+        <w:rPr>
+          <w:rFonts w:ascii="Consolas" w:cs="Consolas" w:eastAsia="Consolas" w:hAnsi="Consolas"/>
+          <w:color w:val="8C1D18"/>
+          <w:sz w:val="19"/>
+          <w:szCs w:val="19"/>
+        </w:rPr>
+        <w:t xml:space="preserve">docs/prompts/requirements.md</w:t>
+      </w:r>
+      <w:r>
+        <w:t xml:space="preserve">) et le prompt système utilisé par l'application.</w:t>
+      </w:r>
+    </w:p>
+    <w:tbl>
+      <w:tblPr>
+        <w:tblW w:type="dxa" w:w="9638"/>
+        <w:tblBorders>
+          <w:top w:val="single" w:color="auto" w:sz="4"/>
+          <w:left w:val="single" w:color="auto" w:sz="4"/>
+          <w:bottom w:val="single" w:color="auto" w:sz="4"/>
+          <w:right w:val="single" w:color="auto" w:sz="4"/>
+          <w:insideH w:val="single" w:color="auto" w:sz="4"/>
+          <w:insideV w:val="single" w:color="auto" w:sz="4"/>
+        </w:tblBorders>
+      </w:tblPr>
+      <w:tblGrid>
+        <w:gridCol w:w="2505"/>
+        <w:gridCol w:w="2200"/>
+        <w:gridCol w:w="4933"/>
+      </w:tblGrid>
+      <w:tr>
+        <w:trPr>
+          <w:tblHeader/>
+        </w:trPr>
+        <w:tc>
+          <w:tcPr>
+            <w:tcW w:type="dxa" w:w="2505"/>
+            <w:shd w:fill="B3261E" w:color="auto" w:val="clear"/>
+            <w:tcMar>
+              <w:top w:type="dxa" w:w="60"/>
+              <w:left w:type="dxa" w:w="100"/>
+              <w:bottom w:type="dxa" w:w="60"/>
+              <w:right w:type="dxa" w:w="100"/>
+            </w:tcMar>
+            <w:vAlign w:val="center"/>
+          </w:tcPr>
+          <w:p>
+            <w:pPr>
+              <w:spacing w:after="0"/>
+            </w:pPr>
+            <w:r>
+              <w:rPr>
+                <w:b/>
+                <w:bCs/>
+                <w:color w:val="FFFFFF"/>
+                <w:sz w:val="19"/>
+                <w:szCs w:val="19"/>
+              </w:rPr>
+              <w:t xml:space="preserve">Prompt</w:t>
+            </w:r>
+          </w:p>
+        </w:tc>
+        <w:tc>
+          <w:tcPr>
+            <w:tcW w:type="dxa" w:w="2200"/>
+            <w:shd w:fill="B3261E" w:color="auto" w:val="clear"/>
+            <w:tcMar>
+              <w:top w:type="dxa" w:w="60"/>
+              <w:left w:type="dxa" w:w="100"/>
+              <w:bottom w:type="dxa" w:w="60"/>
+              <w:right w:type="dxa" w:w="100"/>
+            </w:tcMar>
+            <w:vAlign w:val="center"/>
+          </w:tcPr>
+          <w:p>
+            <w:pPr>
+              <w:spacing w:after="0"/>
+            </w:pPr>
+            <w:r>
+              <w:rPr>
+                <w:b/>
+                <w:bCs/>
+                <w:color w:val="FFFFFF"/>
+                <w:sz w:val="19"/>
+                <w:szCs w:val="19"/>
+              </w:rPr>
+              <w:t xml:space="preserve">Type</w:t>
+            </w:r>
+          </w:p>
+        </w:tc>
+        <w:tc>
+          <w:tcPr>
+            <w:tcW w:type="dxa" w:w="4933"/>
+            <w:shd w:fill="B3261E" w:color="auto" w:val="clear"/>
+            <w:tcMar>
+              <w:top w:type="dxa" w:w="60"/>
+              <w:left w:type="dxa" w:w="100"/>
+              <w:bottom w:type="dxa" w:w="60"/>
+              <w:right w:type="dxa" w:w="100"/>
+            </w:tcMar>
+            <w:vAlign w:val="center"/>
+          </w:tcPr>
+          <w:p>
+            <w:pPr>
+              <w:spacing w:after="0"/>
+            </w:pPr>
+            <w:r>
+              <w:rPr>
+                <w:b/>
+                <w:bCs/>
+                <w:color w:val="FFFFFF"/>
+                <w:sz w:val="19"/>
+                <w:szCs w:val="19"/>
+              </w:rPr>
+              <w:t xml:space="preserve">Rôle</w:t>
+            </w:r>
+          </w:p>
+        </w:tc>
+      </w:tr>
+      <w:tr>
+        <w:tc>
+          <w:tcPr>
+            <w:tcW w:type="dxa" w:w="2505"/>
+            <w:tcMar>
+              <w:top w:type="dxa" w:w="60"/>
+              <w:left w:type="dxa" w:w="100"/>
+              <w:bottom w:type="dxa" w:w="60"/>
+              <w:right w:type="dxa" w:w="100"/>
+            </w:tcMar>
+            <w:vAlign w:val="center"/>
+          </w:tcPr>
+          <w:p>
+            <w:pPr>
+              <w:spacing w:after="0"/>
+            </w:pPr>
+            <w:r>
+              <w:rPr>
+                <w:sz w:val="19"/>
+                <w:szCs w:val="19"/>
+              </w:rPr>
+              <w:t xml:space="preserve">P-M4-001</w:t>
+            </w:r>
+          </w:p>
+        </w:tc>
+        <w:tc>
+          <w:tcPr>
+            <w:tcW w:type="dxa" w:w="2200"/>
+            <w:tcMar>
+              <w:top w:type="dxa" w:w="60"/>
+              <w:left w:type="dxa" w:w="100"/>
+              <w:bottom w:type="dxa" w:w="60"/>
+              <w:right w:type="dxa" w:w="100"/>
+            </w:tcMar>
+            <w:vAlign w:val="center"/>
+          </w:tcPr>
+          <w:p>
+            <w:pPr>
+              <w:spacing w:after="0"/>
+            </w:pPr>
+            <w:r>
+              <w:rPr>
+                <w:sz w:val="19"/>
+                <w:szCs w:val="19"/>
+              </w:rPr>
+              <w:t xml:space="preserve">Développement</w:t>
+            </w:r>
+          </w:p>
+        </w:tc>
+        <w:tc>
+          <w:tcPr>
+            <w:tcW w:type="dxa" w:w="4933"/>
+            <w:tcMar>
+              <w:top w:type="dxa" w:w="60"/>
+              <w:left w:type="dxa" w:w="100"/>
+              <w:bottom w:type="dxa" w:w="60"/>
+              <w:right w:type="dxa" w:w="100"/>
+            </w:tcMar>
+            <w:vAlign w:val="center"/>
+          </w:tcPr>
+          <w:p>
+            <w:pPr>
+              <w:spacing w:after="0"/>
+            </w:pPr>
+            <w:r>
+              <w:rPr>
+                <w:sz w:val="19"/>
+                <w:szCs w:val="19"/>
+              </w:rPr>
+              <w:t xml:space="preserve">Version complète du module : migration, serveur, interface, tests et documentation. Prompt de départ fourni par le chef de projet, complété par la décision commune M3/M4</w:t>
+            </w:r>
+          </w:p>
+        </w:tc>
+      </w:tr>
+      <w:tr>
+        <w:tc>
+          <w:tcPr>
+            <w:tcW w:type="dxa" w:w="2505"/>
+            <w:tcMar>
+              <w:top w:type="dxa" w:w="60"/>
+              <w:left w:type="dxa" w:w="100"/>
+              <w:bottom w:type="dxa" w:w="60"/>
+              <w:right w:type="dxa" w:w="100"/>
+            </w:tcMar>
+            <w:vAlign w:val="center"/>
+          </w:tcPr>
+          <w:p>
+            <w:pPr>
+              <w:spacing w:after="0"/>
+            </w:pPr>
+            <w:r>
+              <w:rPr>
+                <w:sz w:val="19"/>
+                <w:szCs w:val="19"/>
+              </w:rPr>
+              <w:t xml:space="preserve">evaluate-document.md</w:t>
+            </w:r>
+          </w:p>
+        </w:tc>
+        <w:tc>
+          <w:tcPr>
+            <w:tcW w:type="dxa" w:w="2200"/>
+            <w:tcMar>
+              <w:top w:type="dxa" w:w="60"/>
+              <w:left w:type="dxa" w:w="100"/>
+              <w:bottom w:type="dxa" w:w="60"/>
+              <w:right w:type="dxa" w:w="100"/>
+            </w:tcMar>
+            <w:vAlign w:val="center"/>
+          </w:tcPr>
+          <w:p>
+            <w:pPr>
+              <w:spacing w:after="0"/>
+            </w:pPr>
+            <w:r>
+              <w:rPr>
+                <w:sz w:val="19"/>
+                <w:szCs w:val="19"/>
+              </w:rPr>
+              <w:t xml:space="preserve">Système (application)</w:t>
+            </w:r>
+          </w:p>
+        </w:tc>
+        <w:tc>
+          <w:tcPr>
+            <w:tcW w:type="dxa" w:w="4933"/>
+            <w:tcMar>
+              <w:top w:type="dxa" w:w="60"/>
+              <w:left w:type="dxa" w:w="100"/>
+              <w:bottom w:type="dxa" w:w="60"/>
+              <w:right w:type="dxa" w:w="100"/>
+            </w:tcMar>
+            <w:vAlign w:val="center"/>
+          </w:tcPr>
+          <w:p>
+            <w:pPr>
+              <w:spacing w:after="0"/>
+            </w:pPr>
+            <w:r>
+              <w:rPr>
+                <w:sz w:val="19"/>
+                <w:szCs w:val="19"/>
+              </w:rPr>
+              <w:t xml:space="preserve">Évaluation du cahier des charges selon la grille ; v0.1 (squelette) puis v0.2</w:t>
+            </w:r>
+          </w:p>
+        </w:tc>
+      </w:tr>
+    </w:tbl>
+    <w:p>
+      <w:pPr>
+        <w:spacing w:before="80" w:after="240"/>
+        <w:jc w:val="center"/>
+      </w:pPr>
+      <w:r>
+        <w:rPr>
+          <w:i/>
+          <w:iCs/>
+          <w:color w:val="5B6474"/>
+          <w:sz w:val="19"/>
+          <w:szCs w:val="19"/>
+        </w:rPr>
+        <w:t xml:space="preserve">Tableau 17 — Prompts liés au module 4</w:t>
+      </w:r>
+    </w:p>
+    <w:tbl>
+      <w:tblPr>
+        <w:tblW w:type="dxa" w:w="9638"/>
+        <w:tblBorders>
+          <w:top w:val="single" w:color="auto" w:sz="4"/>
+          <w:left w:val="single" w:color="auto" w:sz="4"/>
+          <w:bottom w:val="single" w:color="auto" w:sz="4"/>
+          <w:right w:val="single" w:color="auto" w:sz="4"/>
+          <w:insideH w:val="single" w:color="auto" w:sz="4"/>
+          <w:insideV w:val="single" w:color="auto" w:sz="4"/>
+        </w:tblBorders>
+      </w:tblPr>
+      <w:tblGrid>
+        <w:gridCol w:w="2000"/>
+        <w:gridCol w:w="3300"/>
+        <w:gridCol w:w="4338"/>
+      </w:tblGrid>
+      <w:tr>
+        <w:trPr>
+          <w:tblHeader/>
+        </w:trPr>
+        <w:tc>
+          <w:tcPr>
+            <w:tcW w:type="dxa" w:w="2000"/>
+            <w:shd w:fill="B3261E" w:color="auto" w:val="clear"/>
+            <w:tcMar>
+              <w:top w:type="dxa" w:w="60"/>
+              <w:left w:type="dxa" w:w="100"/>
+              <w:bottom w:type="dxa" w:w="60"/>
+              <w:right w:type="dxa" w:w="100"/>
+            </w:tcMar>
+            <w:vAlign w:val="center"/>
+          </w:tcPr>
+          <w:p>
+            <w:pPr>
+              <w:spacing w:after="0"/>
+            </w:pPr>
+            <w:r>
+              <w:rPr>
+                <w:b/>
+                <w:bCs/>
+                <w:color w:val="FFFFFF"/>
+                <w:sz w:val="19"/>
+                <w:szCs w:val="19"/>
+              </w:rPr>
+              <w:t xml:space="preserve">Aspect</w:t>
+            </w:r>
+          </w:p>
+        </w:tc>
+        <w:tc>
+          <w:tcPr>
+            <w:tcW w:type="dxa" w:w="3300"/>
+            <w:shd w:fill="B3261E" w:color="auto" w:val="clear"/>
+            <w:tcMar>
+              <w:top w:type="dxa" w:w="60"/>
+              <w:left w:type="dxa" w:w="100"/>
+              <w:bottom w:type="dxa" w:w="60"/>
+              <w:right w:type="dxa" w:w="100"/>
+            </w:tcMar>
+            <w:vAlign w:val="center"/>
+          </w:tcPr>
+          <w:p>
+            <w:pPr>
+              <w:spacing w:after="0"/>
+            </w:pPr>
+            <w:r>
+              <w:rPr>
+                <w:b/>
+                <w:bCs/>
+                <w:color w:val="FFFFFF"/>
+                <w:sz w:val="19"/>
+                <w:szCs w:val="19"/>
+              </w:rPr>
+              <w:t xml:space="preserve">Prompt système v0.1</w:t>
+            </w:r>
+          </w:p>
+        </w:tc>
+        <w:tc>
+          <w:tcPr>
+            <w:tcW w:type="dxa" w:w="4338"/>
+            <w:shd w:fill="B3261E" w:color="auto" w:val="clear"/>
+            <w:tcMar>
+              <w:top w:type="dxa" w:w="60"/>
+              <w:left w:type="dxa" w:w="100"/>
+              <w:bottom w:type="dxa" w:w="60"/>
+              <w:right w:type="dxa" w:w="100"/>
+            </w:tcMar>
+            <w:vAlign w:val="center"/>
+          </w:tcPr>
+          <w:p>
+            <w:pPr>
+              <w:spacing w:after="0"/>
+            </w:pPr>
+            <w:r>
+              <w:rPr>
+                <w:b/>
+                <w:bCs/>
+                <w:color w:val="FFFFFF"/>
+                <w:sz w:val="19"/>
+                <w:szCs w:val="19"/>
+              </w:rPr>
+              <w:t xml:space="preserve">Prompt système v0.2 (P-M4-001)</w:t>
+            </w:r>
+          </w:p>
+        </w:tc>
+      </w:tr>
+      <w:tr>
+        <w:tc>
+          <w:tcPr>
+            <w:tcW w:type="dxa" w:w="2000"/>
+            <w:tcMar>
+              <w:top w:type="dxa" w:w="60"/>
+              <w:left w:type="dxa" w:w="100"/>
+              <w:bottom w:type="dxa" w:w="60"/>
+              <w:right w:type="dxa" w:w="100"/>
+            </w:tcMar>
+            <w:vAlign w:val="center"/>
+          </w:tcPr>
+          <w:p>
+            <w:pPr>
+              <w:spacing w:after="0"/>
+            </w:pPr>
+            <w:r>
+              <w:rPr>
+                <w:sz w:val="19"/>
+                <w:szCs w:val="19"/>
+              </w:rPr>
+              <w:t xml:space="preserve">Grille</w:t>
+            </w:r>
+          </w:p>
+        </w:tc>
+        <w:tc>
+          <w:tcPr>
+            <w:tcW w:type="dxa" w:w="3300"/>
+            <w:tcMar>
+              <w:top w:type="dxa" w:w="60"/>
+              <w:left w:type="dxa" w:w="100"/>
+              <w:bottom w:type="dxa" w:w="60"/>
+              <w:right w:type="dxa" w:w="100"/>
+            </w:tcMar>
+            <w:vAlign w:val="center"/>
+          </w:tcPr>
+          <w:p>
+            <w:pPr>
+              <w:spacing w:after="0"/>
+            </w:pPr>
+            <w:r>
+              <w:rPr>
+                <w:sz w:val="19"/>
+                <w:szCs w:val="19"/>
+              </w:rPr>
+              <w:t xml:space="preserve">5 critères (couverture, contraintes, qualité, user stories, priorisation)</w:t>
+            </w:r>
+          </w:p>
+        </w:tc>
+        <w:tc>
+          <w:tcPr>
+            <w:tcW w:type="dxa" w:w="4338"/>
+            <w:tcMar>
+              <w:top w:type="dxa" w:w="60"/>
+              <w:left w:type="dxa" w:w="100"/>
+              <w:bottom w:type="dxa" w:w="60"/>
+              <w:right w:type="dxa" w:w="100"/>
+            </w:tcMar>
+            <w:vAlign w:val="center"/>
+          </w:tcPr>
+          <w:p>
+            <w:pPr>
+              <w:spacing w:after="0"/>
+            </w:pPr>
+            <w:r>
+              <w:rPr>
+                <w:sz w:val="19"/>
+                <w:szCs w:val="19"/>
+              </w:rPr>
+              <w:t xml:space="preserve">6 critères conformes au tableau officiel : couverture du besoin réel (30), contraintes implicites (15), clarté et testabilité (20), absence d'ambiguïtés (15), user stories (10), MoSCoW (10)</w:t>
+            </w:r>
+          </w:p>
+        </w:tc>
+      </w:tr>
+      <w:tr>
+        <w:tc>
+          <w:tcPr>
+            <w:tcW w:type="dxa" w:w="2000"/>
+            <w:tcMar>
+              <w:top w:type="dxa" w:w="60"/>
+              <w:left w:type="dxa" w:w="100"/>
+              <w:bottom w:type="dxa" w:w="60"/>
+              <w:right w:type="dxa" w:w="100"/>
+            </w:tcMar>
+            <w:vAlign w:val="center"/>
+          </w:tcPr>
+          <w:p>
+            <w:pPr>
+              <w:spacing w:after="0"/>
+            </w:pPr>
+            <w:r>
+              <w:rPr>
+                <w:sz w:val="19"/>
+                <w:szCs w:val="19"/>
+              </w:rPr>
+              <w:t xml:space="preserve">Contexte fourni</w:t>
+            </w:r>
+          </w:p>
+        </w:tc>
+        <w:tc>
+          <w:tcPr>
+            <w:tcW w:type="dxa" w:w="3300"/>
+            <w:tcMar>
+              <w:top w:type="dxa" w:w="60"/>
+              <w:left w:type="dxa" w:w="100"/>
+              <w:bottom w:type="dxa" w:w="60"/>
+              <w:right w:type="dxa" w:w="100"/>
+            </w:tcMar>
+            <w:vAlign w:val="center"/>
+          </w:tcPr>
+          <w:p>
+            <w:pPr>
+              <w:spacing w:after="0"/>
+            </w:pPr>
+            <w:r>
+              <w:rPr>
+                <w:sz w:val="19"/>
+                <w:szCs w:val="19"/>
+              </w:rPr>
+              <w:t xml:space="preserve">Besoin exprimé, besoin caché, contraintes</w:t>
+            </w:r>
+          </w:p>
+        </w:tc>
+        <w:tc>
+          <w:tcPr>
+            <w:tcW w:type="dxa" w:w="4338"/>
+            <w:tcMar>
+              <w:top w:type="dxa" w:w="60"/>
+              <w:left w:type="dxa" w:w="100"/>
+              <w:bottom w:type="dxa" w:w="60"/>
+              <w:right w:type="dxa" w:w="100"/>
+            </w:tcMar>
+            <w:vAlign w:val="center"/>
+          </w:tcPr>
+          <w:p>
+            <w:pPr>
+              <w:spacing w:after="0"/>
+            </w:pPr>
+            <w:r>
+              <w:rPr>
+                <w:sz w:val="19"/>
+                <w:szCs w:val="19"/>
+              </w:rPr>
+              <w:t xml:space="preserve">En plus : niveau du scénario, numéro de version, demandes de changement intégrées</w:t>
+            </w:r>
+          </w:p>
+        </w:tc>
+      </w:tr>
+      <w:tr>
+        <w:tc>
+          <w:tcPr>
+            <w:tcW w:type="dxa" w:w="2000"/>
+            <w:tcMar>
+              <w:top w:type="dxa" w:w="60"/>
+              <w:left w:type="dxa" w:w="100"/>
+              <w:bottom w:type="dxa" w:w="60"/>
+              <w:right w:type="dxa" w:w="100"/>
+            </w:tcMar>
+            <w:vAlign w:val="center"/>
+          </w:tcPr>
+          <w:p>
+            <w:pPr>
+              <w:spacing w:after="0"/>
+            </w:pPr>
+            <w:r>
+              <w:rPr>
+                <w:sz w:val="19"/>
+                <w:szCs w:val="19"/>
+              </w:rPr>
+              <w:t xml:space="preserve">Consignes de notation</w:t>
+            </w:r>
+          </w:p>
+        </w:tc>
+        <w:tc>
+          <w:tcPr>
+            <w:tcW w:type="dxa" w:w="3300"/>
+            <w:tcMar>
+              <w:top w:type="dxa" w:w="60"/>
+              <w:left w:type="dxa" w:w="100"/>
+              <w:bottom w:type="dxa" w:w="60"/>
+              <w:right w:type="dxa" w:w="100"/>
+            </w:tcMar>
+            <w:vAlign w:val="center"/>
+          </w:tcPr>
+          <w:p>
+            <w:pPr>
+              <w:spacing w:after="0"/>
+            </w:pPr>
+            <w:r>
+              <w:rPr>
+                <w:sz w:val="19"/>
+                <w:szCs w:val="19"/>
+              </w:rPr>
+              <w:t xml:space="preserve">Aucune</w:t>
+            </w:r>
+          </w:p>
+        </w:tc>
+        <w:tc>
+          <w:tcPr>
+            <w:tcW w:type="dxa" w:w="4338"/>
+            <w:tcMar>
+              <w:top w:type="dxa" w:w="60"/>
+              <w:left w:type="dxa" w:w="100"/>
+              <w:bottom w:type="dxa" w:w="60"/>
+              <w:right w:type="dxa" w:w="100"/>
+            </w:tcMar>
+            <w:vAlign w:val="center"/>
+          </w:tcPr>
+          <w:p>
+            <w:pPr>
+              <w:spacing w:after="0"/>
+            </w:pPr>
+            <w:r>
+              <w:rPr>
+                <w:sz w:val="19"/>
+                <w:szCs w:val="19"/>
+              </w:rPr>
+              <w:t xml:space="preserve">Comparer au besoin réel, exigence adaptée au niveau, commentaires qui citent les codes d'exigences</w:t>
+            </w:r>
+          </w:p>
+        </w:tc>
+      </w:tr>
+      <w:tr>
+        <w:tc>
+          <w:tcPr>
+            <w:tcW w:type="dxa" w:w="2000"/>
+            <w:tcMar>
+              <w:top w:type="dxa" w:w="60"/>
+              <w:left w:type="dxa" w:w="100"/>
+              <w:bottom w:type="dxa" w:w="60"/>
+              <w:right w:type="dxa" w:w="100"/>
+            </w:tcMar>
+            <w:vAlign w:val="center"/>
+          </w:tcPr>
+          <w:p>
+            <w:pPr>
+              <w:spacing w:after="0"/>
+            </w:pPr>
+            <w:r>
+              <w:rPr>
+                <w:sz w:val="19"/>
+                <w:szCs w:val="19"/>
+              </w:rPr>
+              <w:t xml:space="preserve">Protection du besoin caché</w:t>
+            </w:r>
+          </w:p>
+        </w:tc>
+        <w:tc>
+          <w:tcPr>
+            <w:tcW w:type="dxa" w:w="3300"/>
+            <w:tcMar>
+              <w:top w:type="dxa" w:w="60"/>
+              <w:left w:type="dxa" w:w="100"/>
+              <w:bottom w:type="dxa" w:w="60"/>
+              <w:right w:type="dxa" w:w="100"/>
+            </w:tcMar>
+            <w:vAlign w:val="center"/>
+          </w:tcPr>
+          <w:p>
+            <w:pPr>
+              <w:spacing w:after="0"/>
+            </w:pPr>
+            <w:r>
+              <w:rPr>
+                <w:sz w:val="19"/>
+                <w:szCs w:val="19"/>
+              </w:rPr>
+              <w:t xml:space="preserve">Consigne « ne cite jamais »</w:t>
+            </w:r>
+          </w:p>
+        </w:tc>
+        <w:tc>
+          <w:tcPr>
+            <w:tcW w:type="dxa" w:w="4338"/>
+            <w:tcMar>
+              <w:top w:type="dxa" w:w="60"/>
+              <w:left w:type="dxa" w:w="100"/>
+              <w:bottom w:type="dxa" w:w="60"/>
+              <w:right w:type="dxa" w:w="100"/>
+            </w:tcMar>
+            <w:vAlign w:val="center"/>
+          </w:tcPr>
+          <w:p>
+            <w:pPr>
+              <w:spacing w:after="0"/>
+            </w:pPr>
+            <w:r>
+              <w:rPr>
+                <w:sz w:val="19"/>
+                <w:szCs w:val="19"/>
+              </w:rPr>
+              <w:t xml:space="preserve">Exemples interdits et autorisés, et refus automatique par Zod d'un retour qui recopie le besoin caché</w:t>
+            </w:r>
+          </w:p>
+        </w:tc>
+      </w:tr>
+      <w:tr>
+        <w:tc>
+          <w:tcPr>
+            <w:tcW w:type="dxa" w:w="2000"/>
+            <w:tcMar>
+              <w:top w:type="dxa" w:w="60"/>
+              <w:left w:type="dxa" w:w="100"/>
+              <w:bottom w:type="dxa" w:w="60"/>
+              <w:right w:type="dxa" w:w="100"/>
+            </w:tcMar>
+            <w:vAlign w:val="center"/>
+          </w:tcPr>
+          <w:p>
+            <w:pPr>
+              <w:spacing w:after="0"/>
+            </w:pPr>
+            <w:r>
+              <w:rPr>
+                <w:sz w:val="19"/>
+                <w:szCs w:val="19"/>
+              </w:rPr>
+              <w:t xml:space="preserve">Validation Zod</w:t>
+            </w:r>
+          </w:p>
+        </w:tc>
+        <w:tc>
+          <w:tcPr>
+            <w:tcW w:type="dxa" w:w="3300"/>
+            <w:tcMar>
+              <w:top w:type="dxa" w:w="60"/>
+              <w:left w:type="dxa" w:w="100"/>
+              <w:bottom w:type="dxa" w:w="60"/>
+              <w:right w:type="dxa" w:w="100"/>
+            </w:tcMar>
+            <w:vAlign w:val="center"/>
+          </w:tcPr>
+          <w:p>
+            <w:pPr>
+              <w:spacing w:after="0"/>
+            </w:pPr>
+            <w:r>
+              <w:rPr>
+                <w:sz w:val="19"/>
+                <w:szCs w:val="19"/>
+              </w:rPr>
+              <w:t xml:space="preserve">Format seul</w:t>
+            </w:r>
+          </w:p>
+        </w:tc>
+        <w:tc>
+          <w:tcPr>
+            <w:tcW w:type="dxa" w:w="4338"/>
+            <w:tcMar>
+              <w:top w:type="dxa" w:w="60"/>
+              <w:left w:type="dxa" w:w="100"/>
+              <w:bottom w:type="dxa" w:w="60"/>
+              <w:right w:type="dxa" w:w="100"/>
+            </w:tcMar>
+            <w:vAlign w:val="center"/>
+          </w:tcPr>
+          <w:p>
+            <w:pPr>
+              <w:spacing w:after="0"/>
+            </w:pPr>
+            <w:r>
+              <w:rPr>
+                <w:sz w:val="19"/>
+                <w:szCs w:val="19"/>
+              </w:rPr>
+              <w:t xml:space="preserve">Critères et barème imposés, 1 à 4 pistes, note globale recalculée par le serveur</w:t>
+            </w:r>
+          </w:p>
+        </w:tc>
+      </w:tr>
+    </w:tbl>
+    <w:p>
+      <w:pPr>
+        <w:spacing w:before="80" w:after="240"/>
+        <w:jc w:val="center"/>
+      </w:pPr>
+      <w:r>
+        <w:rPr>
+          <w:i/>
+          <w:iCs/>
+          <w:color w:val="5B6474"/>
+          <w:sz w:val="19"/>
+          <w:szCs w:val="19"/>
+        </w:rPr>
+        <w:t xml:space="preserve">Tableau 18 — Évolution du prompt système du module 4</w:t>
+      </w:r>
+    </w:p>
+    <w:p>
+      <w:pPr>
+        <w:spacing w:after="120" w:line="300"/>
+        <w:jc w:val="both"/>
+      </w:pPr>
+      <w:r>
+        <w:t xml:space="preserve">Si l'évaluation recopie un passage du besoin caché ou d'une contrainte implicite (le texte entier ou six mots consécutifs, sans tenir compte des accents ni des majuscules), le schéma Zod la rejette et le service IA partagé relance l'appel : la consigne du prompt est doublée d'une vérification par le code.</w:t>
+      </w:r>
+    </w:p>
+    <w:p>
+      <w:pPr>
+        <w:keepNext/>
+        <w:pBdr>
+          <w:top w:val="dashed" w:color="B3261E" w:sz="12" w:space="12"/>
+          <w:left w:val="dashed" w:color="B3261E" w:sz="12" w:space="12"/>
+          <w:bottom w:val="dashed" w:color="B3261E" w:sz="12" w:space="12"/>
+          <w:right w:val="dashed" w:color="B3261E" w:sz="12" w:space="12"/>
+        </w:pBdr>
+        <w:shd w:fill="FDECEB" w:color="auto" w:val="clear"/>
+        <w:spacing w:before="240" w:after="40"/>
+        <w:jc w:val="center"/>
+      </w:pPr>
+      <w:r>
+        <w:rPr>
+          <w:b/>
+          <w:bCs/>
+          <w:color w:val="B3261E"/>
+        </w:rPr>
+        <w:t xml:space="preserve">[CAPTURE À INSÉRER] </w:t>
+      </w:r>
+      <w:r>
+        <w:rPr>
+          <w:rFonts w:ascii="Consolas" w:cs="Consolas" w:eastAsia="Consolas" w:hAnsi="Consolas"/>
+          <w:color w:val="8C1D18"/>
+          <w:sz w:val="19"/>
+          <w:szCs w:val="19"/>
+        </w:rPr>
+        <w:t xml:space="preserve">docs/rapport/captures/p-m4-001-01-prompt.png</w:t>
+      </w:r>
+      <w:r>
+        <w:rPr>
+          <w:color w:val="8C1D18"/>
+        </w:rPr>
+        <w:t xml:space="preserve"> — prompt P-M4-001 envoyé dans Claude Code</w:t>
+      </w:r>
+    </w:p>
+    <w:p>
+      <w:pPr>
+        <w:spacing w:after="240"/>
+        <w:jc w:val="center"/>
+      </w:pPr>
+      <w:r>
+        <w:rPr>
+          <w:i/>
+          <w:iCs/>
+          <w:color w:val="5B6474"/>
+          <w:sz w:val="19"/>
+          <w:szCs w:val="19"/>
+        </w:rPr>
+        <w:t xml:space="preserve">Figure 32 — Le prompt P-M4-001 envoyé dans Claude Code</w:t>
+      </w:r>
+    </w:p>
+    <w:p>
+      <w:pPr>
+        <w:keepNext/>
+        <w:pBdr>
+          <w:top w:val="dashed" w:color="B3261E" w:sz="12" w:space="12"/>
+          <w:left w:val="dashed" w:color="B3261E" w:sz="12" w:space="12"/>
+          <w:bottom w:val="dashed" w:color="B3261E" w:sz="12" w:space="12"/>
+          <w:right w:val="dashed" w:color="B3261E" w:sz="12" w:space="12"/>
+        </w:pBdr>
+        <w:shd w:fill="FDECEB" w:color="auto" w:val="clear"/>
+        <w:spacing w:before="240" w:after="40"/>
+        <w:jc w:val="center"/>
+      </w:pPr>
+      <w:r>
+        <w:rPr>
+          <w:b/>
+          <w:bCs/>
+          <w:color w:val="B3261E"/>
+        </w:rPr>
+        <w:t xml:space="preserve">[CAPTURE À INSÉRER] </w:t>
+      </w:r>
+      <w:r>
+        <w:rPr>
+          <w:rFonts w:ascii="Consolas" w:cs="Consolas" w:eastAsia="Consolas" w:hAnsi="Consolas"/>
+          <w:color w:val="8C1D18"/>
+          <w:sz w:val="19"/>
+          <w:szCs w:val="19"/>
+        </w:rPr>
+        <w:t xml:space="preserve">docs/rapport/captures/p-m4-001-02-plan.png</w:t>
+      </w:r>
+      <w:r>
+        <w:rPr>
+          <w:color w:val="8C1D18"/>
+        </w:rPr>
+        <w:t xml:space="preserve"> — plan proposé par l'IA et ses 5 questions</w:t>
+      </w:r>
+    </w:p>
+    <w:p>
+      <w:pPr>
+        <w:spacing w:after="240"/>
+        <w:jc w:val="center"/>
+      </w:pPr>
+      <w:r>
+        <w:rPr>
+          <w:i/>
+          <w:iCs/>
+          <w:color w:val="5B6474"/>
+          <w:sz w:val="19"/>
+          <w:szCs w:val="19"/>
+        </w:rPr>
+        <w:t xml:space="preserve">Figure 33 — Le plan proposé par l'IA pour le module 4, avant toute modification</w:t>
+      </w:r>
+    </w:p>
+    <w:p>
+      <w:pPr>
+        <w:pStyle w:val="Heading3"/>
+      </w:pPr>
+      <w:r>
+        <w:t xml:space="preserve">Réalisation et captures</w:t>
+      </w:r>
+    </w:p>
+    <w:p>
+      <w:pPr>
+        <w:spacing w:after="120" w:line="300"/>
+        <w:jc w:val="both"/>
+      </w:pPr>
+      <w:r>
+        <w:t xml:space="preserve">L'interface suit les maquettes 05 et 06 du chapitre 4 (figures 23 et 24) et la charte graphique : en-tête de page, parcours de séance, onglets par type, cartes d'exigences, formulaire à droite, puis note globale, détail par critère avec jauges et pistes d'amélioration. Les captures ci-dessous ont été prises sur l'application lancée en mode simulé, avec le scénario de démonstration « Boulangerie artisanale ».</w:t>
+      </w:r>
+    </w:p>
+    <w:p>
+      <w:pPr>
+        <w:keepNext/>
+        <w:spacing w:before="160" w:after="40"/>
+        <w:jc w:val="center"/>
+      </w:pPr>
+      <w:r>
+        <w:drawing>
+          <wp:inline distT="0" distB="0" distL="0" distR="0">
+            <wp:extent cx="6096000" cy="6244167"/>
+            <wp:effectExtent t="0" r="0" b="0" l="0"/>
+            <wp:docPr id="4000" name="p-m4-001-04-ecran-editeur.png" descr="Module 4 réalisé : éditeur du cahier des charges (brouillon)" title="Module 4 réalisé : éditeur du cahier des charges (brouillon)"/>
+            <wp:cNvGraphicFramePr>
+              <a:graphicFrameLocks xmlns:a="http://schemas.openxmlformats.org/drawingml/2006/main" noChangeAspect="1"/>
+            </wp:cNvGraphicFramePr>
+            <a:graphic xmlns:a="http://schemas.openxmlformats.org/drawingml/2006/main">
+              <a:graphicData uri="http://schemas.openxmlformats.org/drawingml/2006/picture">
+                <pic:pic xmlns:pic="http://schemas.openxmlformats.org/drawingml/2006/picture">
+                  <pic:nvPicPr>
+                    <pic:cNvPr id="4000" name="p-m4-001-04-ecran-editeur.png" descr=""/>
+                    <pic:cNvPicPr>
+                      <a:picLocks noChangeAspect="1" noChangeArrowheads="1"/>
+                    </pic:cNvPicPr>
+                  </pic:nvPicPr>
+                  <pic:blipFill>
+                    <a:blip r:embed="rId55" cstate="none"/>
+                    <a:srcRect/>
+                    <a:stretch>
+                      <a:fillRect/>
+                    </a:stretch>
+                  </pic:blipFill>
+                  <pic:spPr bwMode="auto">
+                    <a:xfrm>
+                      <a:off x="0" y="0"/>
+                      <a:ext cx="6096000" cy="6244167"/>
+                    </a:xfrm>
+                    <a:prstGeom prst="rect">
+                      <a:avLst/>
+                    </a:prstGeom>
+                  </pic:spPr>
+                </pic:pic>
+              </a:graphicData>
+            </a:graphic>
+          </wp:inline>
+        </w:drawing>
+      </w:r>
+    </w:p>
+    <w:p>
+      <w:pPr>
+        <w:spacing w:after="240"/>
+        <w:jc w:val="center"/>
+      </w:pPr>
+      <w:r>
+        <w:rPr>
+          <w:i/>
+          <w:iCs/>
+          <w:color w:val="5B6474"/>
+          <w:sz w:val="19"/>
+          <w:szCs w:val="19"/>
+        </w:rPr>
+        <w:t xml:space="preserve">Figure 34 — Module 4 réalisé : éditeur du cahier des charges (brouillon)</w:t>
+      </w:r>
+    </w:p>
+    <w:p>
+      <w:pPr>
+        <w:keepNext/>
+        <w:spacing w:before="160" w:after="40"/>
+        <w:jc w:val="center"/>
+      </w:pPr>
+      <w:r>
+        <w:drawing>
+          <wp:inline distT="0" distB="0" distL="0" distR="0">
+            <wp:extent cx="6096000" cy="3856567"/>
+            <wp:effectExtent t="0" r="0" b="0" l="0"/>
+            <wp:docPr id="4001" name="p-m4-001-05-ecran-evaluation.png" descr="Module 4 réalisé : évaluation de la version 1 (mode simulé)" title="Module 4 réalisé : évaluation de la version 1 (mode simulé)"/>
+            <wp:cNvGraphicFramePr>
+              <a:graphicFrameLocks xmlns:a="http://schemas.openxmlformats.org/drawingml/2006/main" noChangeAspect="1"/>
+            </wp:cNvGraphicFramePr>
+            <a:graphic xmlns:a="http://schemas.openxmlformats.org/drawingml/2006/main">
+              <a:graphicData uri="http://schemas.openxmlformats.org/drawingml/2006/picture">
+                <pic:pic xmlns:pic="http://schemas.openxmlformats.org/drawingml/2006/picture">
+                  <pic:nvPicPr>
+                    <pic:cNvPr id="4001" name="p-m4-001-05-ecran-evaluation.png" descr=""/>
+                    <pic:cNvPicPr>
+                      <a:picLocks noChangeAspect="1" noChangeArrowheads="1"/>
+                    </pic:cNvPicPr>
+                  </pic:nvPicPr>
+                  <pic:blipFill>
+                    <a:blip r:embed="rId56" cstate="none"/>
+                    <a:srcRect/>
+                    <a:stretch>
+                      <a:fillRect/>
+                    </a:stretch>
+                  </pic:blipFill>
+                  <pic:spPr bwMode="auto">
+                    <a:xfrm>
+                      <a:off x="0" y="0"/>
+                      <a:ext cx="6096000" cy="3856567"/>
+                    </a:xfrm>
+                    <a:prstGeom prst="rect">
+                      <a:avLst/>
+                    </a:prstGeom>
+                  </pic:spPr>
+                </pic:pic>
+              </a:graphicData>
+            </a:graphic>
+          </wp:inline>
+        </w:drawing>
+      </w:r>
+    </w:p>
+    <w:p>
+      <w:pPr>
+        <w:spacing w:after="240"/>
+        <w:jc w:val="center"/>
+      </w:pPr>
+      <w:r>
+        <w:rPr>
+          <w:i/>
+          <w:iCs/>
+          <w:color w:val="5B6474"/>
+          <w:sz w:val="19"/>
+          <w:szCs w:val="19"/>
+        </w:rPr>
+        <w:t xml:space="preserve">Figure 35 — Module 4 réalisé : évaluation de la version 1 (mode simulé)</w:t>
+      </w:r>
+    </w:p>
+    <w:p>
+      <w:pPr>
+        <w:spacing w:after="120" w:line="300"/>
+        <w:jc w:val="both"/>
+      </w:pPr>
+      <w:r>
+        <w:t xml:space="preserve">L'évaluation simulée réagit au contenu : par exemple, l'exigence ENF-02 « rapide et intuitive » fait perdre des points au critère « Absence d'ambiguïtés », et les pistes restent générales, sans révéler le besoin caché.</w:t>
+      </w:r>
+    </w:p>
+    <w:p>
+      <w:pPr>
+        <w:keepNext/>
+        <w:spacing w:before="160" w:after="40"/>
+        <w:jc w:val="center"/>
+      </w:pPr>
+      <w:r>
+        <w:drawing>
+          <wp:inline distT="0" distB="0" distL="0" distR="0">
+            <wp:extent cx="6096000" cy="7374467"/>
+            <wp:effectExtent t="0" r="0" b="0" l="0"/>
+            <wp:docPr id="4002" name="p-m4-001-06-ecran-nouvelle-version.png" descr="Module 4 réalisé : nouvelle version après une demande de changement acceptée" title="Module 4 réalisé : nouvelle version après une demande de changement acceptée"/>
+            <wp:cNvGraphicFramePr>
+              <a:graphicFrameLocks xmlns:a="http://schemas.openxmlformats.org/drawingml/2006/main" noChangeAspect="1"/>
+            </wp:cNvGraphicFramePr>
+            <a:graphic xmlns:a="http://schemas.openxmlformats.org/drawingml/2006/main">
+              <a:graphicData uri="http://schemas.openxmlformats.org/drawingml/2006/picture">
+                <pic:pic xmlns:pic="http://schemas.openxmlformats.org/drawingml/2006/picture">
+                  <pic:nvPicPr>
+                    <pic:cNvPr id="4002" name="p-m4-001-06-ecran-nouvelle-version.png" descr=""/>
+                    <pic:cNvPicPr>
+                      <a:picLocks noChangeAspect="1" noChangeArrowheads="1"/>
+                    </pic:cNvPicPr>
+                  </pic:nvPicPr>
+                  <pic:blipFill>
+                    <a:blip r:embed="rId57" cstate="none"/>
+                    <a:srcRect/>
+                    <a:stretch>
+                      <a:fillRect/>
+                    </a:stretch>
+                  </pic:blipFill>
+                  <pic:spPr bwMode="auto">
+                    <a:xfrm>
+                      <a:off x="0" y="0"/>
+                      <a:ext cx="6096000" cy="7374467"/>
+                    </a:xfrm>
+                    <a:prstGeom prst="rect">
+                      <a:avLst/>
+                    </a:prstGeom>
+                  </pic:spPr>
+                </pic:pic>
+              </a:graphicData>
+            </a:graphic>
+          </wp:inline>
+        </w:drawing>
+      </w:r>
+    </w:p>
+    <w:p>
+      <w:pPr>
+        <w:spacing w:after="240"/>
+        <w:jc w:val="center"/>
+      </w:pPr>
+      <w:r>
+        <w:rPr>
+          <w:i/>
+          <w:iCs/>
+          <w:color w:val="5B6474"/>
+          <w:sz w:val="19"/>
+          <w:szCs w:val="19"/>
+        </w:rPr>
+        <w:t xml:space="preserve">Figure 36 — Module 4 réalisé : nouvelle version après une demande de changement acceptée</w:t>
+      </w:r>
+    </w:p>
+    <w:p>
+      <w:pPr>
+        <w:keepNext/>
+        <w:spacing w:before="160" w:after="40"/>
+        <w:jc w:val="center"/>
+      </w:pPr>
+      <w:r>
+        <w:drawing>
+          <wp:inline distT="0" distB="0" distL="0" distR="0">
+            <wp:extent cx="6096000" cy="6773333"/>
+            <wp:effectExtent t="0" r="0" b="0" l="0"/>
+            <wp:docPr id="4003" name="p-m4-001-07-ecran-versions.png" descr="Module 4 réalisé : historique des versions et contenu figé de la version 1" title="Module 4 réalisé : historique des versions et contenu figé de la version 1"/>
+            <wp:cNvGraphicFramePr>
+              <a:graphicFrameLocks xmlns:a="http://schemas.openxmlformats.org/drawingml/2006/main" noChangeAspect="1"/>
+            </wp:cNvGraphicFramePr>
+            <a:graphic xmlns:a="http://schemas.openxmlformats.org/drawingml/2006/main">
+              <a:graphicData uri="http://schemas.openxmlformats.org/drawingml/2006/picture">
+                <pic:pic xmlns:pic="http://schemas.openxmlformats.org/drawingml/2006/picture">
+                  <pic:nvPicPr>
+                    <pic:cNvPr id="4003" name="p-m4-001-07-ecran-versions.png" descr=""/>
+                    <pic:cNvPicPr>
+                      <a:picLocks noChangeAspect="1" noChangeArrowheads="1"/>
+                    </pic:cNvPicPr>
+                  </pic:nvPicPr>
+                  <pic:blipFill>
+                    <a:blip r:embed="rId58" cstate="none"/>
+                    <a:srcRect/>
+                    <a:stretch>
+                      <a:fillRect/>
+                    </a:stretch>
+                  </pic:blipFill>
+                  <pic:spPr bwMode="auto">
+                    <a:xfrm>
+                      <a:off x="0" y="0"/>
+                      <a:ext cx="6096000" cy="6773333"/>
+                    </a:xfrm>
+                    <a:prstGeom prst="rect">
+                      <a:avLst/>
+                    </a:prstGeom>
+                  </pic:spPr>
+                </pic:pic>
+              </a:graphicData>
+            </a:graphic>
+          </wp:inline>
+        </w:drawing>
+      </w:r>
+    </w:p>
+    <w:p>
+      <w:pPr>
+        <w:spacing w:after="240"/>
+        <w:jc w:val="center"/>
+      </w:pPr>
+      <w:r>
+        <w:rPr>
+          <w:i/>
+          <w:iCs/>
+          <w:color w:val="5B6474"/>
+          <w:sz w:val="19"/>
+          <w:szCs w:val="19"/>
+        </w:rPr>
+        <w:t xml:space="preserve">Figure 37 — Module 4 réalisé : historique des versions et contenu figé de la version 1</w:t>
+      </w:r>
+    </w:p>
+    <w:p>
+      <w:pPr>
+        <w:spacing w:after="120" w:line="300"/>
+        <w:jc w:val="both"/>
+      </w:pPr>
+      <w:r>
+        <w:t xml:space="preserve">Par rapport à la maquette 05, l'écran réalisé ajoute le statut du document, les boutons de réordonnancement et de suppression, l'aide à la rédaction et l'historique des versions. La page d'évaluation reprend la maquette 06 avec six critères au lieu de cinq ; les jauges sont vertes à partir de 70 %, orange à partir de 50 % et rouges en dessous. Pour les figures 36 et 37, la demande de changement a été passée au statut « acceptée » directement en base, car la réponse aux demandes (module 3) n'était pas encore livrée.</w:t>
+      </w:r>
+    </w:p>
+    <w:p>
+      <w:pPr>
+        <w:pStyle w:val="Heading3"/>
+      </w:pPr>
+      <w:r>
+        <w:t xml:space="preserve">Tests</w:t>
+      </w:r>
+    </w:p>
+    <w:p>
+      <w:pPr>
+        <w:spacing w:after="120" w:line="300"/>
+        <w:jc w:val="both"/>
+      </w:pPr>
+      <w:r>
+        <w:t xml:space="preserve">Le module est couvert par 26 tests automatisés, exécutés avec ceux de la base commune et du module 1 (57 tests au total, tous réussis) :</w:t>
+      </w:r>
+    </w:p>
+    <w:p>
+      <w:pPr>
+        <w:pStyle w:val="ListParagraph"/>
+        <w:numPr>
+          <w:ilvl w:val="0"/>
+          <w:numId w:val="2"/>
+        </w:numPr>
+        <w:spacing w:after="60" w:line="280"/>
+      </w:pPr>
+      <w:r>
+        <w:t xml:space="preserve">validation des schémas : préfixe du code cohérent avec le type, codes en double refusés, raison et contenu obligatoires pour une nouvelle version, numéro de version de l'URL contrôlé ;</w:t>
+      </w:r>
+    </w:p>
+    <w:p>
+      <w:pPr>
+        <w:pStyle w:val="ListParagraph"/>
+        <w:numPr>
+          <w:ilvl w:val="0"/>
+          <w:numId w:val="2"/>
+        </w:numPr>
+        <w:spacing w:after="60" w:line="280"/>
+      </w:pPr>
+      <w:r>
+        <w:t xml:space="preserve">protection du besoin caché : une évaluation qui recopie le besoin caché ou une contrainte implicite est refusée, de même qu'un critère manquant ou une note supérieure au barème ;</w:t>
+      </w:r>
+    </w:p>
+    <w:p>
+      <w:pPr>
+        <w:pStyle w:val="ListParagraph"/>
+        <w:numPr>
+          <w:ilvl w:val="0"/>
+          <w:numId w:val="2"/>
+        </w:numPr>
+        <w:spacing w:after="60" w:line="280"/>
+      </w:pPr>
+      <w:r>
+        <w:t xml:space="preserve">évaluation simulée conforme au schéma et croissante avec la qualité du document (vide, minimal, complet) ; prompt v0.2 sans variable manquante ;</w:t>
+      </w:r>
+    </w:p>
+    <w:p>
+      <w:pPr>
+        <w:pStyle w:val="ListParagraph"/>
+        <w:numPr>
+          <w:ilvl w:val="0"/>
+          <w:numId w:val="2"/>
+        </w:numPr>
+        <w:spacing w:after="60" w:line="280"/>
+      </w:pPr>
+      <w:r>
+        <w:t xml:space="preserve">endpoints testés sur une vraie base : authentification, rôles (403 pour l'enseignant et pour un autre étudiant), statuts (409 pour une modification après soumission, l'évaluation d'un brouillon ou une double évaluation), versions (demande en attente, refusée ou d'une autre séance refusée ; une seule version par demande), et absence de </w:t>
+      </w:r>
+      <w:r>
+        <w:rPr>
+          <w:rFonts w:ascii="Consolas" w:cs="Consolas" w:eastAsia="Consolas" w:hAnsi="Consolas"/>
+          <w:color w:val="8C1D18"/>
+          <w:sz w:val="19"/>
+          <w:szCs w:val="19"/>
+        </w:rPr>
+        <w:t xml:space="preserve">hiddenNeed</w:t>
+      </w:r>
+      <w:r>
+        <w:t xml:space="preserve"> et </w:t>
+      </w:r>
+      <w:r>
+        <w:rPr>
+          <w:rFonts w:ascii="Consolas" w:cs="Consolas" w:eastAsia="Consolas" w:hAnsi="Consolas"/>
+          <w:color w:val="8C1D18"/>
+          <w:sz w:val="19"/>
+          <w:szCs w:val="19"/>
+        </w:rPr>
+        <w:t xml:space="preserve">implicitConstraints</w:t>
+      </w:r>
+      <w:r>
+        <w:t xml:space="preserve"> dans toutes les réponses.</w:t>
+      </w:r>
+    </w:p>
+    <w:p>
+      <w:pPr>
+        <w:spacing w:after="120" w:line="300"/>
+        <w:jc w:val="both"/>
+      </w:pPr>
+      <w:r>
+        <w:t xml:space="preserve">Le serveur a aussi été lancé et ses 8 endpoints appelés (16 appels) : tous les codes de retour sont ceux attendus, aucune réponse ne contient de secret et le filet de sécurité </w:t>
+      </w:r>
+      <w:r>
+        <w:rPr>
+          <w:rFonts w:ascii="Consolas" w:cs="Consolas" w:eastAsia="Consolas" w:hAnsi="Consolas"/>
+          <w:color w:val="8C1D18"/>
+          <w:sz w:val="19"/>
+          <w:szCs w:val="19"/>
+        </w:rPr>
+        <w:t xml:space="preserve">responseGuard</w:t>
+      </w:r>
+      <w:r>
+        <w:t xml:space="preserve"> n'a jamais eu à intervenir.</w:t>
+      </w:r>
+    </w:p>
+    <w:p>
+      <w:pPr>
+        <w:pStyle w:val="Heading3"/>
+      </w:pPr>
+      <w:r>
+        <w:t xml:space="preserve">Difficultés et apport de l'IA</w:t>
+      </w:r>
+    </w:p>
+    <w:p>
+      <w:pPr>
+        <w:pStyle w:val="ListParagraph"/>
+        <w:numPr>
+          <w:ilvl w:val="0"/>
+          <w:numId w:val="2"/>
+        </w:numPr>
+        <w:spacing w:after="60" w:line="280"/>
+      </w:pPr>
+      <w:r>
+        <w:rPr>
+          <w:b/>
+          <w:bCs/>
+        </w:rPr>
+        <w:t xml:space="preserve">Faille dans le squelette</w:t>
+      </w:r>
+      <w:r>
+        <w:t xml:space="preserve"> : l'enregistrement ne bloquait que le statut « soumis » ; un document déjà évalué pouvait être modifié et repasser en brouillon. L'IA l'a repéré en lisant le code existant et l'a corrigé (réponse 409).</w:t>
+      </w:r>
+    </w:p>
+    <w:p>
+      <w:pPr>
+        <w:pStyle w:val="ListParagraph"/>
+        <w:numPr>
+          <w:ilvl w:val="0"/>
+          <w:numId w:val="2"/>
+        </w:numPr>
+        <w:spacing w:after="60" w:line="280"/>
+      </w:pPr>
+      <w:r>
+        <w:rPr>
+          <w:b/>
+          <w:bCs/>
+        </w:rPr>
+        <w:t xml:space="preserve">Numérotation</w:t>
+      </w:r>
+      <w:r>
+        <w:t xml:space="preserve"> : calculée côté client par comptage, elle pouvait attribuer deux fois le même code après une suppression. Les codes sont désormais stables et leur unicité est vérifiée côté serveur.</w:t>
+      </w:r>
+    </w:p>
+    <w:p>
+      <w:pPr>
+        <w:pStyle w:val="ListParagraph"/>
+        <w:numPr>
+          <w:ilvl w:val="0"/>
+          <w:numId w:val="2"/>
+        </w:numPr>
+        <w:spacing w:after="60" w:line="280"/>
+      </w:pPr>
+      <w:r>
+        <w:rPr>
+          <w:b/>
+          <w:bCs/>
+        </w:rPr>
+        <w:t xml:space="preserve">Relecture des captures</w:t>
+      </w:r>
+      <w:r>
+        <w:t xml:space="preserve"> : en vérifiant les captures de ce rapport, l'IA a repéré une liste déroulante qui débordait du formulaire, des colonnes décalées (ordre de chargement des feuilles de style) et des accords incorrects dans l'évaluation simulée (« 2 exigence non fonctionnelles »). Ces défauts ont été corrigés avant l'insertion des captures.</w:t>
+      </w:r>
+    </w:p>
+    <w:p>
+      <w:pPr>
+        <w:pStyle w:val="ListParagraph"/>
+        <w:numPr>
+          <w:ilvl w:val="0"/>
+          <w:numId w:val="2"/>
+        </w:numPr>
+        <w:spacing w:after="60" w:line="280"/>
+      </w:pPr>
+      <w:r>
+        <w:rPr>
+          <w:b/>
+          <w:bCs/>
+        </w:rPr>
+        <w:t xml:space="preserve">Dépendance au module 3</w:t>
+      </w:r>
+      <w:r>
+        <w:t xml:space="preserve"> : l'endpoint de réponse aux demandes de changement n'existant pas encore, la création des versions a été testée en modifiant la demande directement en base. L'intégration reste à valider avec le module 3.</w:t>
+      </w:r>
+    </w:p>
+    <w:p>
+      <w:pPr>
+        <w:pStyle w:val="ListParagraph"/>
+        <w:numPr>
+          <w:ilvl w:val="0"/>
+          <w:numId w:val="2"/>
+        </w:numPr>
+        <w:spacing w:after="60" w:line="280"/>
+      </w:pPr>
+      <w:r>
+        <w:rPr>
+          <w:b/>
+          <w:bCs/>
+        </w:rPr>
+        <w:t xml:space="preserve">Décisions humaines</w:t>
+      </w:r>
+      <w:r>
+        <w:t xml:space="preserve"> : la solution commune M3/M4 (prise avec le module 3 et le chef de projet), la grille à six critères, l'enregistrement atomique d'une version avec ses exigences, des codes stables et une seule évaluation par version. Ces choix ont été proposés dans le plan de l'IA et validés par le responsable du module avant la génération.</w:t>
+      </w:r>
+    </w:p>
+    <w:p>
+      <w:pPr>
+        <w:keepNext/>
+        <w:pBdr>
+          <w:top w:val="dashed" w:color="B3261E" w:sz="12" w:space="12"/>
+          <w:left w:val="dashed" w:color="B3261E" w:sz="12" w:space="12"/>
+          <w:bottom w:val="dashed" w:color="B3261E" w:sz="12" w:space="12"/>
+          <w:right w:val="dashed" w:color="B3261E" w:sz="12" w:space="12"/>
+        </w:pBdr>
+        <w:shd w:fill="FDECEB" w:color="auto" w:val="clear"/>
+        <w:spacing w:before="240" w:after="40"/>
+        <w:jc w:val="center"/>
+      </w:pPr>
+      <w:r>
+        <w:rPr>
+          <w:b/>
+          <w:bCs/>
+          <w:color w:val="B3261E"/>
+        </w:rPr>
+        <w:t xml:space="preserve">[CAPTURE À INSÉRER] </w:t>
+      </w:r>
+      <w:r>
+        <w:rPr>
+          <w:rFonts w:ascii="Consolas" w:cs="Consolas" w:eastAsia="Consolas" w:hAnsi="Consolas"/>
+          <w:color w:val="8C1D18"/>
+          <w:sz w:val="19"/>
+          <w:szCs w:val="19"/>
+        </w:rPr>
+        <w:t xml:space="preserve">docs/rapport/captures/p-m4-001-03-resume.png</w:t>
+      </w:r>
+      <w:r>
+        <w:rPr>
+          <w:color w:val="8C1D18"/>
+        </w:rPr>
+        <w:t xml:space="preserve"> — résumé en 6 points produit par l'IA</w:t>
+      </w:r>
+    </w:p>
+    <w:p>
+      <w:pPr>
+        <w:spacing w:after="240"/>
+        <w:jc w:val="center"/>
+      </w:pPr>
+      <w:r>
+        <w:rPr>
+          <w:i/>
+          <w:iCs/>
+          <w:color w:val="5B6474"/>
+          <w:sz w:val="19"/>
+          <w:szCs w:val="19"/>
+        </w:rPr>
+        <w:t xml:space="preserve">Figure 38 — Le résumé produit par l'IA à la fin du prompt P-M4-001</w:t>
+      </w:r>
+    </w:p>
+    <w:p>
+      <w:pPr>
         <w:pBdr>
           <w:left w:val="single" w:color="E8890C" w:sz="24" w:space="8"/>
         </w:pBdr>
@@ -13482,7 +16537,7 @@
         <w:rPr>
           <w:color w:val="8A5A00"/>
         </w:rPr>
-        <w:t xml:space="preserve">décrire les fonctionnalités réalisées et les endpoints implémentés.</w:t>
+        <w:t xml:space="preserve">ajouter ce que le responsable du module a vérifié, corrigé ou refusé lui-même après P-M4-001 (rubrique « Modifications de l'équipe » du journal).</w:t>
       </w:r>
     </w:p>
     <w:p>
@@ -13490,7 +16545,46 @@
         <w:pStyle w:val="Heading3"/>
       </w:pPr>
       <w:r>
-        <w:t xml:space="preserve">Prompts utilisés</w:t>
+        <w:t xml:space="preserve">Limites et perspectives</w:t>
+      </w:r>
+    </w:p>
+    <w:p>
+      <w:pPr>
+        <w:pStyle w:val="ListParagraph"/>
+        <w:numPr>
+          <w:ilvl w:val="0"/>
+          <w:numId w:val="2"/>
+        </w:numPr>
+        <w:spacing w:after="60" w:line="280"/>
+      </w:pPr>
+      <w:r>
+        <w:t xml:space="preserve">Le prompt système v0.2 n'a pas encore été évalué avec un vrai fournisseur (Claude ou OpenAI), faute de clé API.</w:t>
+      </w:r>
+    </w:p>
+    <w:p>
+      <w:pPr>
+        <w:pStyle w:val="ListParagraph"/>
+        <w:numPr>
+          <w:ilvl w:val="0"/>
+          <w:numId w:val="2"/>
+        </w:numPr>
+        <w:spacing w:after="60" w:line="280"/>
+      </w:pPr>
+      <w:r>
+        <w:t xml:space="preserve">Le mode simulé ne connaît pas le besoin caché : sa note de couverture dépend du volume et de la diversité des exigences, pas de leur pertinence réelle.</w:t>
+      </w:r>
+    </w:p>
+    <w:p>
+      <w:pPr>
+        <w:pStyle w:val="ListParagraph"/>
+        <w:numPr>
+          <w:ilvl w:val="0"/>
+          <w:numId w:val="2"/>
+        </w:numPr>
+        <w:spacing w:after="60" w:line="280"/>
+      </w:pPr>
+      <w:r>
+        <w:t xml:space="preserve">Le contenu de l'entretien (module 2) n'est pas encore transmis au prompt d'évaluation, et deux versions ne peuvent pas être comparées visuellement (différences surlignées).</w:t>
       </w:r>
     </w:p>
     <w:p>
@@ -13513,69 +16607,7 @@
         <w:rPr>
           <w:color w:val="8A5A00"/>
         </w:rPr>
-        <w:t xml:space="preserve">lister les prompts du journal (P-xxx) liés au module : prompts de développement adressés à l'assistant et prompts système de l'application (dossier prompts/), avec leurs versions successives.</w:t>
-      </w:r>
-    </w:p>
-    <w:p>
-      <w:pPr>
-        <w:pStyle w:val="Heading3"/>
-      </w:pPr>
-      <w:r>
-        <w:t xml:space="preserve">Réalisation et captures</w:t>
-      </w:r>
-    </w:p>
-    <w:p>
-      <w:pPr>
-        <w:pBdr>
-          <w:left w:val="single" w:color="E8890C" w:sz="24" w:space="8"/>
-        </w:pBdr>
-        <w:shd w:fill="FFF6E0" w:color="auto" w:val="clear"/>
-        <w:spacing w:before="80" w:after="160"/>
-      </w:pPr>
-      <w:r>
-        <w:rPr>
-          <w:b/>
-          <w:bCs/>
-          <w:color w:val="8A5A00"/>
-        </w:rPr>
-        <w:t xml:space="preserve">À compléter : </w:t>
-      </w:r>
-      <w:r>
-        <w:rPr>
-          <w:color w:val="8A5A00"/>
-        </w:rPr>
-        <w:t xml:space="preserve">ajouter les captures des écrans réalisés et les comparer aux maquettes du chapitre 4.</w:t>
-      </w:r>
-    </w:p>
-    <w:p>
-      <w:pPr>
-        <w:pStyle w:val="Heading3"/>
-      </w:pPr>
-      <w:r>
-        <w:t xml:space="preserve">Difficultés et apport de l'IA</w:t>
-      </w:r>
-    </w:p>
-    <w:p>
-      <w:pPr>
-        <w:pBdr>
-          <w:left w:val="single" w:color="E8890C" w:sz="24" w:space="8"/>
-        </w:pBdr>
-        <w:shd w:fill="FFF6E0" w:color="auto" w:val="clear"/>
-        <w:spacing w:before="80" w:after="160"/>
-      </w:pPr>
-      <w:r>
-        <w:rPr>
-          <w:b/>
-          <w:bCs/>
-          <w:color w:val="8A5A00"/>
-        </w:rPr>
-        <w:t xml:space="preserve">À compléter : </w:t>
-      </w:r>
-      <w:r>
-        <w:rPr>
-          <w:color w:val="8A5A00"/>
-        </w:rPr>
-        <w:t xml:space="preserve">analyser ce que l'IA a bien fait, ce qu'il a fallu corriger à la main, et les limites rencontrées.</w:t>
+        <w:t xml:space="preserve">après un test avec un vrai fournisseur, comparer une évaluation réelle à l'évaluation simulée sur le même cahier des charges.</w:t>
       </w:r>
     </w:p>
     <w:p>
@@ -17051,6 +20083,692 @@
           </w:p>
         </w:tc>
       </w:tr>
+      <w:tr>
+        <w:tc>
+          <w:tcPr>
+            <w:tcW w:type="dxa" w:w="590"/>
+            <w:tcMar>
+              <w:top w:type="dxa" w:w="60"/>
+              <w:left w:type="dxa" w:w="100"/>
+              <w:bottom w:type="dxa" w:w="60"/>
+              <w:right w:type="dxa" w:w="100"/>
+            </w:tcMar>
+            <w:vAlign w:val="center"/>
+          </w:tcPr>
+          <w:p>
+            <w:pPr>
+              <w:spacing w:after="0"/>
+            </w:pPr>
+            <w:r>
+              <w:rPr>
+                <w:sz w:val="19"/>
+                <w:szCs w:val="19"/>
+              </w:rPr>
+              <w:t xml:space="preserve">16</w:t>
+            </w:r>
+          </w:p>
+        </w:tc>
+        <w:tc>
+          <w:tcPr>
+            <w:tcW w:type="dxa" w:w="3540"/>
+            <w:tcMar>
+              <w:top w:type="dxa" w:w="60"/>
+              <w:left w:type="dxa" w:w="100"/>
+              <w:bottom w:type="dxa" w:w="60"/>
+              <w:right w:type="dxa" w:w="100"/>
+            </w:tcMar>
+            <w:vAlign w:val="center"/>
+          </w:tcPr>
+          <w:p>
+            <w:pPr>
+              <w:spacing w:after="0"/>
+            </w:pPr>
+            <w:r>
+              <w:rPr>
+                <w:sz w:val="19"/>
+                <w:szCs w:val="19"/>
+              </w:rPr>
+              <w:t xml:space="preserve">p-m4-001-01-prompt</w:t>
+            </w:r>
+          </w:p>
+        </w:tc>
+        <w:tc>
+          <w:tcPr>
+            <w:tcW w:type="dxa" w:w="4327"/>
+            <w:tcMar>
+              <w:top w:type="dxa" w:w="60"/>
+              <w:left w:type="dxa" w:w="100"/>
+              <w:bottom w:type="dxa" w:w="60"/>
+              <w:right w:type="dxa" w:w="100"/>
+            </w:tcMar>
+            <w:vAlign w:val="center"/>
+          </w:tcPr>
+          <w:p>
+            <w:pPr>
+              <w:spacing w:after="0"/>
+            </w:pPr>
+            <w:r>
+              <w:rPr>
+                <w:sz w:val="19"/>
+                <w:szCs w:val="19"/>
+              </w:rPr>
+              <w:t xml:space="preserve">Prompt P-M4-001</w:t>
+            </w:r>
+          </w:p>
+        </w:tc>
+        <w:tc>
+          <w:tcPr>
+            <w:tcW w:type="dxa" w:w="1181"/>
+            <w:tcMar>
+              <w:top w:type="dxa" w:w="60"/>
+              <w:left w:type="dxa" w:w="100"/>
+              <w:bottom w:type="dxa" w:w="60"/>
+              <w:right w:type="dxa" w:w="100"/>
+            </w:tcMar>
+            <w:vAlign w:val="center"/>
+          </w:tcPr>
+          <w:p>
+            <w:pPr>
+              <w:spacing w:after="0"/>
+            </w:pPr>
+            <w:r>
+              <w:rPr>
+                <w:sz w:val="19"/>
+                <w:szCs w:val="19"/>
+              </w:rPr>
+              <w:t xml:space="preserve">À insérer</w:t>
+            </w:r>
+          </w:p>
+        </w:tc>
+      </w:tr>
+      <w:tr>
+        <w:tc>
+          <w:tcPr>
+            <w:tcW w:type="dxa" w:w="590"/>
+            <w:tcMar>
+              <w:top w:type="dxa" w:w="60"/>
+              <w:left w:type="dxa" w:w="100"/>
+              <w:bottom w:type="dxa" w:w="60"/>
+              <w:right w:type="dxa" w:w="100"/>
+            </w:tcMar>
+            <w:vAlign w:val="center"/>
+          </w:tcPr>
+          <w:p>
+            <w:pPr>
+              <w:spacing w:after="0"/>
+            </w:pPr>
+            <w:r>
+              <w:rPr>
+                <w:sz w:val="19"/>
+                <w:szCs w:val="19"/>
+              </w:rPr>
+              <w:t xml:space="preserve">17</w:t>
+            </w:r>
+          </w:p>
+        </w:tc>
+        <w:tc>
+          <w:tcPr>
+            <w:tcW w:type="dxa" w:w="3540"/>
+            <w:tcMar>
+              <w:top w:type="dxa" w:w="60"/>
+              <w:left w:type="dxa" w:w="100"/>
+              <w:bottom w:type="dxa" w:w="60"/>
+              <w:right w:type="dxa" w:w="100"/>
+            </w:tcMar>
+            <w:vAlign w:val="center"/>
+          </w:tcPr>
+          <w:p>
+            <w:pPr>
+              <w:spacing w:after="0"/>
+            </w:pPr>
+            <w:r>
+              <w:rPr>
+                <w:sz w:val="19"/>
+                <w:szCs w:val="19"/>
+              </w:rPr>
+              <w:t xml:space="preserve">p-m4-001-02-plan</w:t>
+            </w:r>
+          </w:p>
+        </w:tc>
+        <w:tc>
+          <w:tcPr>
+            <w:tcW w:type="dxa" w:w="4327"/>
+            <w:tcMar>
+              <w:top w:type="dxa" w:w="60"/>
+              <w:left w:type="dxa" w:w="100"/>
+              <w:bottom w:type="dxa" w:w="60"/>
+              <w:right w:type="dxa" w:w="100"/>
+            </w:tcMar>
+            <w:vAlign w:val="center"/>
+          </w:tcPr>
+          <w:p>
+            <w:pPr>
+              <w:spacing w:after="0"/>
+            </w:pPr>
+            <w:r>
+              <w:rPr>
+                <w:sz w:val="19"/>
+                <w:szCs w:val="19"/>
+              </w:rPr>
+              <w:t xml:space="preserve">Plan du module 4 et questions de l'IA</w:t>
+            </w:r>
+          </w:p>
+        </w:tc>
+        <w:tc>
+          <w:tcPr>
+            <w:tcW w:type="dxa" w:w="1181"/>
+            <w:tcMar>
+              <w:top w:type="dxa" w:w="60"/>
+              <w:left w:type="dxa" w:w="100"/>
+              <w:bottom w:type="dxa" w:w="60"/>
+              <w:right w:type="dxa" w:w="100"/>
+            </w:tcMar>
+            <w:vAlign w:val="center"/>
+          </w:tcPr>
+          <w:p>
+            <w:pPr>
+              <w:spacing w:after="0"/>
+            </w:pPr>
+            <w:r>
+              <w:rPr>
+                <w:sz w:val="19"/>
+                <w:szCs w:val="19"/>
+              </w:rPr>
+              <w:t xml:space="preserve">À insérer</w:t>
+            </w:r>
+          </w:p>
+        </w:tc>
+      </w:tr>
+      <w:tr>
+        <w:tc>
+          <w:tcPr>
+            <w:tcW w:type="dxa" w:w="590"/>
+            <w:tcMar>
+              <w:top w:type="dxa" w:w="60"/>
+              <w:left w:type="dxa" w:w="100"/>
+              <w:bottom w:type="dxa" w:w="60"/>
+              <w:right w:type="dxa" w:w="100"/>
+            </w:tcMar>
+            <w:vAlign w:val="center"/>
+          </w:tcPr>
+          <w:p>
+            <w:pPr>
+              <w:spacing w:after="0"/>
+            </w:pPr>
+            <w:r>
+              <w:rPr>
+                <w:sz w:val="19"/>
+                <w:szCs w:val="19"/>
+              </w:rPr>
+              <w:t xml:space="preserve">18</w:t>
+            </w:r>
+          </w:p>
+        </w:tc>
+        <w:tc>
+          <w:tcPr>
+            <w:tcW w:type="dxa" w:w="3540"/>
+            <w:tcMar>
+              <w:top w:type="dxa" w:w="60"/>
+              <w:left w:type="dxa" w:w="100"/>
+              <w:bottom w:type="dxa" w:w="60"/>
+              <w:right w:type="dxa" w:w="100"/>
+            </w:tcMar>
+            <w:vAlign w:val="center"/>
+          </w:tcPr>
+          <w:p>
+            <w:pPr>
+              <w:spacing w:after="0"/>
+            </w:pPr>
+            <w:r>
+              <w:rPr>
+                <w:sz w:val="19"/>
+                <w:szCs w:val="19"/>
+              </w:rPr>
+              <w:t xml:space="preserve">p-m4-001-03-resume</w:t>
+            </w:r>
+          </w:p>
+        </w:tc>
+        <w:tc>
+          <w:tcPr>
+            <w:tcW w:type="dxa" w:w="4327"/>
+            <w:tcMar>
+              <w:top w:type="dxa" w:w="60"/>
+              <w:left w:type="dxa" w:w="100"/>
+              <w:bottom w:type="dxa" w:w="60"/>
+              <w:right w:type="dxa" w:w="100"/>
+            </w:tcMar>
+            <w:vAlign w:val="center"/>
+          </w:tcPr>
+          <w:p>
+            <w:pPr>
+              <w:spacing w:after="0"/>
+            </w:pPr>
+            <w:r>
+              <w:rPr>
+                <w:sz w:val="19"/>
+                <w:szCs w:val="19"/>
+              </w:rPr>
+              <w:t xml:space="preserve">Résumé final de P-M4-001</w:t>
+            </w:r>
+          </w:p>
+        </w:tc>
+        <w:tc>
+          <w:tcPr>
+            <w:tcW w:type="dxa" w:w="1181"/>
+            <w:tcMar>
+              <w:top w:type="dxa" w:w="60"/>
+              <w:left w:type="dxa" w:w="100"/>
+              <w:bottom w:type="dxa" w:w="60"/>
+              <w:right w:type="dxa" w:w="100"/>
+            </w:tcMar>
+            <w:vAlign w:val="center"/>
+          </w:tcPr>
+          <w:p>
+            <w:pPr>
+              <w:spacing w:after="0"/>
+            </w:pPr>
+            <w:r>
+              <w:rPr>
+                <w:sz w:val="19"/>
+                <w:szCs w:val="19"/>
+              </w:rPr>
+              <w:t xml:space="preserve">À insérer</w:t>
+            </w:r>
+          </w:p>
+        </w:tc>
+      </w:tr>
+      <w:tr>
+        <w:tc>
+          <w:tcPr>
+            <w:tcW w:type="dxa" w:w="590"/>
+            <w:tcMar>
+              <w:top w:type="dxa" w:w="60"/>
+              <w:left w:type="dxa" w:w="100"/>
+              <w:bottom w:type="dxa" w:w="60"/>
+              <w:right w:type="dxa" w:w="100"/>
+            </w:tcMar>
+            <w:vAlign w:val="center"/>
+          </w:tcPr>
+          <w:p>
+            <w:pPr>
+              <w:spacing w:after="0"/>
+            </w:pPr>
+            <w:r>
+              <w:rPr>
+                <w:sz w:val="19"/>
+                <w:szCs w:val="19"/>
+              </w:rPr>
+              <w:t xml:space="preserve">19</w:t>
+            </w:r>
+          </w:p>
+        </w:tc>
+        <w:tc>
+          <w:tcPr>
+            <w:tcW w:type="dxa" w:w="3540"/>
+            <w:tcMar>
+              <w:top w:type="dxa" w:w="60"/>
+              <w:left w:type="dxa" w:w="100"/>
+              <w:bottom w:type="dxa" w:w="60"/>
+              <w:right w:type="dxa" w:w="100"/>
+            </w:tcMar>
+            <w:vAlign w:val="center"/>
+          </w:tcPr>
+          <w:p>
+            <w:pPr>
+              <w:spacing w:after="0"/>
+            </w:pPr>
+            <w:r>
+              <w:rPr>
+                <w:sz w:val="19"/>
+                <w:szCs w:val="19"/>
+              </w:rPr>
+              <w:t xml:space="preserve">p-m4-001-04-ecran-editeur</w:t>
+            </w:r>
+          </w:p>
+        </w:tc>
+        <w:tc>
+          <w:tcPr>
+            <w:tcW w:type="dxa" w:w="4327"/>
+            <w:tcMar>
+              <w:top w:type="dxa" w:w="60"/>
+              <w:left w:type="dxa" w:w="100"/>
+              <w:bottom w:type="dxa" w:w="60"/>
+              <w:right w:type="dxa" w:w="100"/>
+            </w:tcMar>
+            <w:vAlign w:val="center"/>
+          </w:tcPr>
+          <w:p>
+            <w:pPr>
+              <w:spacing w:after="0"/>
+            </w:pPr>
+            <w:r>
+              <w:rPr>
+                <w:sz w:val="19"/>
+                <w:szCs w:val="19"/>
+              </w:rPr>
+              <w:t xml:space="preserve">Écran réalisé : éditeur du cahier des charges</w:t>
+            </w:r>
+          </w:p>
+        </w:tc>
+        <w:tc>
+          <w:tcPr>
+            <w:tcW w:type="dxa" w:w="1181"/>
+            <w:tcMar>
+              <w:top w:type="dxa" w:w="60"/>
+              <w:left w:type="dxa" w:w="100"/>
+              <w:bottom w:type="dxa" w:w="60"/>
+              <w:right w:type="dxa" w:w="100"/>
+            </w:tcMar>
+            <w:vAlign w:val="center"/>
+          </w:tcPr>
+          <w:p>
+            <w:pPr>
+              <w:spacing w:after="0"/>
+            </w:pPr>
+            <w:r>
+              <w:rPr>
+                <w:sz w:val="19"/>
+                <w:szCs w:val="19"/>
+              </w:rPr>
+              <w:t xml:space="preserve">Insérée</w:t>
+            </w:r>
+          </w:p>
+        </w:tc>
+      </w:tr>
+      <w:tr>
+        <w:tc>
+          <w:tcPr>
+            <w:tcW w:type="dxa" w:w="590"/>
+            <w:tcMar>
+              <w:top w:type="dxa" w:w="60"/>
+              <w:left w:type="dxa" w:w="100"/>
+              <w:bottom w:type="dxa" w:w="60"/>
+              <w:right w:type="dxa" w:w="100"/>
+            </w:tcMar>
+            <w:vAlign w:val="center"/>
+          </w:tcPr>
+          <w:p>
+            <w:pPr>
+              <w:spacing w:after="0"/>
+            </w:pPr>
+            <w:r>
+              <w:rPr>
+                <w:sz w:val="19"/>
+                <w:szCs w:val="19"/>
+              </w:rPr>
+              <w:t xml:space="preserve">20</w:t>
+            </w:r>
+          </w:p>
+        </w:tc>
+        <w:tc>
+          <w:tcPr>
+            <w:tcW w:type="dxa" w:w="3540"/>
+            <w:tcMar>
+              <w:top w:type="dxa" w:w="60"/>
+              <w:left w:type="dxa" w:w="100"/>
+              <w:bottom w:type="dxa" w:w="60"/>
+              <w:right w:type="dxa" w:w="100"/>
+            </w:tcMar>
+            <w:vAlign w:val="center"/>
+          </w:tcPr>
+          <w:p>
+            <w:pPr>
+              <w:spacing w:after="0"/>
+            </w:pPr>
+            <w:r>
+              <w:rPr>
+                <w:sz w:val="19"/>
+                <w:szCs w:val="19"/>
+              </w:rPr>
+              <w:t xml:space="preserve">p-m4-001-05-ecran-evaluation</w:t>
+            </w:r>
+          </w:p>
+        </w:tc>
+        <w:tc>
+          <w:tcPr>
+            <w:tcW w:type="dxa" w:w="4327"/>
+            <w:tcMar>
+              <w:top w:type="dxa" w:w="60"/>
+              <w:left w:type="dxa" w:w="100"/>
+              <w:bottom w:type="dxa" w:w="60"/>
+              <w:right w:type="dxa" w:w="100"/>
+            </w:tcMar>
+            <w:vAlign w:val="center"/>
+          </w:tcPr>
+          <w:p>
+            <w:pPr>
+              <w:spacing w:after="0"/>
+            </w:pPr>
+            <w:r>
+              <w:rPr>
+                <w:sz w:val="19"/>
+                <w:szCs w:val="19"/>
+              </w:rPr>
+              <w:t xml:space="preserve">Écran réalisé : évaluation par l'IA</w:t>
+            </w:r>
+          </w:p>
+        </w:tc>
+        <w:tc>
+          <w:tcPr>
+            <w:tcW w:type="dxa" w:w="1181"/>
+            <w:tcMar>
+              <w:top w:type="dxa" w:w="60"/>
+              <w:left w:type="dxa" w:w="100"/>
+              <w:bottom w:type="dxa" w:w="60"/>
+              <w:right w:type="dxa" w:w="100"/>
+            </w:tcMar>
+            <w:vAlign w:val="center"/>
+          </w:tcPr>
+          <w:p>
+            <w:pPr>
+              <w:spacing w:after="0"/>
+            </w:pPr>
+            <w:r>
+              <w:rPr>
+                <w:sz w:val="19"/>
+                <w:szCs w:val="19"/>
+              </w:rPr>
+              <w:t xml:space="preserve">Insérée</w:t>
+            </w:r>
+          </w:p>
+        </w:tc>
+      </w:tr>
+      <w:tr>
+        <w:tc>
+          <w:tcPr>
+            <w:tcW w:type="dxa" w:w="590"/>
+            <w:tcMar>
+              <w:top w:type="dxa" w:w="60"/>
+              <w:left w:type="dxa" w:w="100"/>
+              <w:bottom w:type="dxa" w:w="60"/>
+              <w:right w:type="dxa" w:w="100"/>
+            </w:tcMar>
+            <w:vAlign w:val="center"/>
+          </w:tcPr>
+          <w:p>
+            <w:pPr>
+              <w:spacing w:after="0"/>
+            </w:pPr>
+            <w:r>
+              <w:rPr>
+                <w:sz w:val="19"/>
+                <w:szCs w:val="19"/>
+              </w:rPr>
+              <w:t xml:space="preserve">21</w:t>
+            </w:r>
+          </w:p>
+        </w:tc>
+        <w:tc>
+          <w:tcPr>
+            <w:tcW w:type="dxa" w:w="3540"/>
+            <w:tcMar>
+              <w:top w:type="dxa" w:w="60"/>
+              <w:left w:type="dxa" w:w="100"/>
+              <w:bottom w:type="dxa" w:w="60"/>
+              <w:right w:type="dxa" w:w="100"/>
+            </w:tcMar>
+            <w:vAlign w:val="center"/>
+          </w:tcPr>
+          <w:p>
+            <w:pPr>
+              <w:spacing w:after="0"/>
+            </w:pPr>
+            <w:r>
+              <w:rPr>
+                <w:sz w:val="19"/>
+                <w:szCs w:val="19"/>
+              </w:rPr>
+              <w:t xml:space="preserve">p-m4-001-06-ecran-nouvelle-version</w:t>
+            </w:r>
+          </w:p>
+        </w:tc>
+        <w:tc>
+          <w:tcPr>
+            <w:tcW w:type="dxa" w:w="4327"/>
+            <w:tcMar>
+              <w:top w:type="dxa" w:w="60"/>
+              <w:left w:type="dxa" w:w="100"/>
+              <w:bottom w:type="dxa" w:w="60"/>
+              <w:right w:type="dxa" w:w="100"/>
+            </w:tcMar>
+            <w:vAlign w:val="center"/>
+          </w:tcPr>
+          <w:p>
+            <w:pPr>
+              <w:spacing w:after="0"/>
+            </w:pPr>
+            <w:r>
+              <w:rPr>
+                <w:sz w:val="19"/>
+                <w:szCs w:val="19"/>
+              </w:rPr>
+              <w:t xml:space="preserve">Écran réalisé : nouvelle version après une demande</w:t>
+            </w:r>
+          </w:p>
+        </w:tc>
+        <w:tc>
+          <w:tcPr>
+            <w:tcW w:type="dxa" w:w="1181"/>
+            <w:tcMar>
+              <w:top w:type="dxa" w:w="60"/>
+              <w:left w:type="dxa" w:w="100"/>
+              <w:bottom w:type="dxa" w:w="60"/>
+              <w:right w:type="dxa" w:w="100"/>
+            </w:tcMar>
+            <w:vAlign w:val="center"/>
+          </w:tcPr>
+          <w:p>
+            <w:pPr>
+              <w:spacing w:after="0"/>
+            </w:pPr>
+            <w:r>
+              <w:rPr>
+                <w:sz w:val="19"/>
+                <w:szCs w:val="19"/>
+              </w:rPr>
+              <w:t xml:space="preserve">Insérée</w:t>
+            </w:r>
+          </w:p>
+        </w:tc>
+      </w:tr>
+      <w:tr>
+        <w:tc>
+          <w:tcPr>
+            <w:tcW w:type="dxa" w:w="590"/>
+            <w:tcMar>
+              <w:top w:type="dxa" w:w="60"/>
+              <w:left w:type="dxa" w:w="100"/>
+              <w:bottom w:type="dxa" w:w="60"/>
+              <w:right w:type="dxa" w:w="100"/>
+            </w:tcMar>
+            <w:vAlign w:val="center"/>
+          </w:tcPr>
+          <w:p>
+            <w:pPr>
+              <w:spacing w:after="0"/>
+            </w:pPr>
+            <w:r>
+              <w:rPr>
+                <w:sz w:val="19"/>
+                <w:szCs w:val="19"/>
+              </w:rPr>
+              <w:t xml:space="preserve">22</w:t>
+            </w:r>
+          </w:p>
+        </w:tc>
+        <w:tc>
+          <w:tcPr>
+            <w:tcW w:type="dxa" w:w="3540"/>
+            <w:tcMar>
+              <w:top w:type="dxa" w:w="60"/>
+              <w:left w:type="dxa" w:w="100"/>
+              <w:bottom w:type="dxa" w:w="60"/>
+              <w:right w:type="dxa" w:w="100"/>
+            </w:tcMar>
+            <w:vAlign w:val="center"/>
+          </w:tcPr>
+          <w:p>
+            <w:pPr>
+              <w:spacing w:after="0"/>
+            </w:pPr>
+            <w:r>
+              <w:rPr>
+                <w:sz w:val="19"/>
+                <w:szCs w:val="19"/>
+              </w:rPr>
+              <w:t xml:space="preserve">p-m4-001-07-ecran-versions</w:t>
+            </w:r>
+          </w:p>
+        </w:tc>
+        <w:tc>
+          <w:tcPr>
+            <w:tcW w:type="dxa" w:w="4327"/>
+            <w:tcMar>
+              <w:top w:type="dxa" w:w="60"/>
+              <w:left w:type="dxa" w:w="100"/>
+              <w:bottom w:type="dxa" w:w="60"/>
+              <w:right w:type="dxa" w:w="100"/>
+            </w:tcMar>
+            <w:vAlign w:val="center"/>
+          </w:tcPr>
+          <w:p>
+            <w:pPr>
+              <w:spacing w:after="0"/>
+            </w:pPr>
+            <w:r>
+              <w:rPr>
+                <w:sz w:val="19"/>
+                <w:szCs w:val="19"/>
+              </w:rPr>
+              <w:t xml:space="preserve">Écran réalisé : historique des versions</w:t>
+            </w:r>
+          </w:p>
+        </w:tc>
+        <w:tc>
+          <w:tcPr>
+            <w:tcW w:type="dxa" w:w="1181"/>
+            <w:tcMar>
+              <w:top w:type="dxa" w:w="60"/>
+              <w:left w:type="dxa" w:w="100"/>
+              <w:bottom w:type="dxa" w:w="60"/>
+              <w:right w:type="dxa" w:w="100"/>
+            </w:tcMar>
+            <w:vAlign w:val="center"/>
+          </w:tcPr>
+          <w:p>
+            <w:pPr>
+              <w:spacing w:after="0"/>
+            </w:pPr>
+            <w:r>
+              <w:rPr>
+                <w:sz w:val="19"/>
+                <w:szCs w:val="19"/>
+              </w:rPr>
+              <w:t xml:space="preserve">Insérée</w:t>
+            </w:r>
+          </w:p>
+        </w:tc>
+      </w:tr>
     </w:tbl>
     <w:p>
       <w:pPr>
@@ -17065,7 +20783,7 @@
           <w:sz w:val="19"/>
           <w:szCs w:val="19"/>
         </w:rPr>
-        <w:t xml:space="preserve">Tableau 15 — Liste des captures</w:t>
+        <w:t xml:space="preserve">Tableau 19 — Liste des captures</w:t>
       </w:r>
     </w:p>
     <w:sectPr>

</xml_diff>